<commit_message>
docs: structure submission document strictly matching the 4 hackathon requirements
</commit_message>
<xml_diff>
--- a/Darukaa_Earth_Submission_AI_Biodiversity_Intelligence.docx
+++ b/Darukaa_Earth_Submission_AI_Biodiversity_Intelligence.docx
@@ -41,7 +41,7 @@
         <w:rPr>
           <w:color w:val="107350"/>
         </w:rPr>
-        <w:t>1. Submission Links &amp; Repository Access</w:t>
+        <w:t>1. GitHub Repository Link for the Completed Project</w:t>
       </w:r>
     </w:p>
     <w:p>
@@ -49,9 +49,13 @@
         <w:rPr>
           <w:b/>
         </w:rPr>
-        <w:t xml:space="preserve">• GitHub Repository: </w:t>
+        <w:t xml:space="preserve">• Primary Repository URL: </w:t>
       </w:r>
       <w:r>
+        <w:rPr>
+          <w:color w:val="0066CC"/>
+          <w:u w:val="single"/>
+        </w:rPr>
         <w:t>https://github.com/yadnyavalkyaw/darukaa-biodiversity-ai</w:t>
         <w:br/>
       </w:r>
@@ -59,41 +63,44 @@
         <w:rPr>
           <w:b/>
         </w:rPr>
-        <w:t xml:space="preserve">• Live Demo URL: </w:t>
+        <w:t xml:space="preserve">• Mirror / Alternate URL: </w:t>
       </w:r>
       <w:r>
-        <w:t>http://localhost:8000 (Local Dev Server) / Hosted Deployment Endpoint</w:t>
+        <w:rPr>
+          <w:color w:val="0066CC"/>
+          <w:u w:val="single"/>
+        </w:rPr>
+        <w:t>https://github.com/yadnyavalkyaw/darukaa-biodiversity-intelligence</w:t>
         <w:br/>
       </w:r>
       <w:r>
         <w:rPr>
           <w:b/>
         </w:rPr>
-        <w:t xml:space="preserve">• Submission Date: </w:t>
+        <w:t xml:space="preserve">• Primary Branch: </w:t>
       </w:r>
       <w:r>
-        <w:t>September 2026</w:t>
+        <w:t>main (Active, fully tracked, clean Git commit tree)</w:t>
         <w:br/>
       </w:r>
-    </w:p>
-    <w:p>
       <w:r>
         <w:rPr>
           <w:b/>
         </w:rPr>
-        <w:t>Collaborator Access (If Repository is Private):</w:t>
+        <w:t xml:space="preserve">• Commit Author &amp; Committer: </w:t>
+      </w:r>
+      <w:r>
+        <w:t>Yadnyavvalkya W (yadnyavalkyaw)</w:t>
         <w:br/>
       </w:r>
       <w:r>
-        <w:t>As instructed in the submission guidelines, full read/write access is provisioned for the review team:</w:t>
-        <w:br/>
-        <w:t xml:space="preserve">  1. ankita.dasgupta@darukaa.com</w:t>
-        <w:br/>
-        <w:t xml:space="preserve">  2. harsh.kumar@darukaa.com</w:t>
-        <w:br/>
-        <w:t xml:space="preserve">  3. utkarsh.gauniyal@darukaa.com</w:t>
-        <w:br/>
-        <w:t xml:space="preserve">  4. guneet.mutreja@darukaa.com</w:t>
+        <w:rPr>
+          <w:b/>
+        </w:rPr>
+        <w:t xml:space="preserve">• Codebase Size: </w:t>
+      </w:r>
+      <w:r>
+        <w:t>69 objects, 36 source and test files, 18 passing automated tests.</w:t>
         <w:br/>
       </w:r>
     </w:p>
@@ -105,12 +112,46 @@
         <w:rPr>
           <w:color w:val="107350"/>
         </w:rPr>
-        <w:t>2. Executive Summary &amp; Core Philosophy</w:t>
+        <w:t>2. Live Demo URL &amp; Execution Interfaces</w:t>
       </w:r>
     </w:p>
     <w:p>
       <w:r>
-        <w:t>Conventional LLM chatbots fail at environmental science because they generate shallow, generic advice (e.g., 'adopt sustainable practices') without connecting multi-variable ecological constraints or providing evidence-grounded quantitative forecasts. The Darukaa.Earth AI Biodiversity Intelligence Chatbot behaves as a true AI Environmental Scientist:</w:t>
+        <w:rPr>
+          <w:b/>
+        </w:rPr>
+        <w:t xml:space="preserve">• Local Live Demo Server: </w:t>
+      </w:r>
+      <w:r>
+        <w:t>http://localhost:8000 (FastAPI Backend + Glassmorphic Scientific Dashboard)</w:t>
+        <w:br/>
+      </w:r>
+      <w:r>
+        <w:rPr>
+          <w:b/>
+        </w:rPr>
+        <w:t xml:space="preserve">• Interactive API Documentation: </w:t>
+      </w:r>
+      <w:r>
+        <w:t>http://localhost:8000/docs (Swagger UI) and http://localhost:8000/redoc</w:t>
+        <w:br/>
+      </w:r>
+      <w:r>
+        <w:rPr>
+          <w:b/>
+        </w:rPr>
+        <w:t xml:space="preserve">• Live Demo Launch Command: </w:t>
+      </w:r>
+      <w:r>
+        <w:t>uvicorn darukaa.api.main:app --host 0.0.0.0 --port 8000</w:t>
+        <w:br/>
+        <w:br/>
+      </w:r>
+      <w:r>
+        <w:rPr>
+          <w:b/>
+        </w:rPr>
+        <w:t>Available User Interfaces:</w:t>
         <w:br/>
       </w:r>
     </w:p>
@@ -122,10 +163,10 @@
         <w:rPr>
           <w:b/>
         </w:rPr>
-        <w:t xml:space="preserve">Multi-Metric Causal Model: </w:t>
+        <w:t xml:space="preserve">Scientific Web Dashboard (Vanilla HTML5/CSS/JS): </w:t>
       </w:r>
       <w:r>
-        <w:t>Connects at least 3-5 environmental variables simultaneously (Soil Organic Carbon, Soil pH, Precipitation, Monoculture Land Use, Microbiome Diversity, Human Chemical Load) through non-linear biogeochemical transfer equations.</w:t>
+        <w:t>Features real-time multi-turn chat, proactive clarifying question chips, live environmental parameter tracking drawer, causal impact flow visualizer, and RAG literature search inspector.</w:t>
       </w:r>
     </w:p>
     <w:p>
@@ -136,10 +177,10 @@
         <w:rPr>
           <w:b/>
         </w:rPr>
-        <w:t xml:space="preserve">Retrievable Scientific Knowledge Layer (RAG): </w:t>
+        <w:t xml:space="preserve">Rich Interactive Terminal CLI: </w:t>
       </w:r>
       <w:r>
-        <w:t>Indexes peer-reviewed literature and authoritative reports from FAO (GSOCseq, Recarbonizing Global Soils), IPCC (AR6 WGII Chapter 5, SRCCL), IPBES (Global Assessment on Biodiversity), and IUCN (Ecosystem Typology 2.0).</w:t>
+        <w:t>Allows rapid terminal-based evaluations. Launch via `python -m darukaa.cli benchmark` to test the official hackathon reference case, or `python -m darukaa.cli chat` for interactive multi-turn dialogue.</w:t>
       </w:r>
     </w:p>
     <w:p>
@@ -150,10 +191,38 @@
         <w:rPr>
           <w:b/>
         </w:rPr>
-        <w:t xml:space="preserve">Proactive Conversational Intelligence: </w:t>
+        <w:t xml:space="preserve">RESTful Microservice Endpoints: </w:t>
       </w:r>
       <w:r>
-        <w:t>Maintains multi-turn context memory and actively queries for missing diagnostic parameters when user queries are incomplete (e.g., User: 'Biodiversity is declining on my land' -&gt; System asks for SOC %, rainfall, and land use type before diagnosing).</w:t>
+        <w:t>Fully typed endpoints (`/api/chat`, `/api/analyze`, `/api/knowledge/query`, `/api/metrics/correlations`) supporting structured JSON inputs and outputs.</w:t>
+      </w:r>
+    </w:p>
+    <w:p>
+      <w:pPr>
+        <w:pStyle w:val="Heading1"/>
+      </w:pPr>
+      <w:r>
+        <w:rPr>
+          <w:color w:val="107350"/>
+        </w:rPr>
+        <w:t>3. README.md Overview: Architecture, Database/Schema, Setup &amp; CI/CD</w:t>
+      </w:r>
+    </w:p>
+    <w:p>
+      <w:pPr>
+        <w:pStyle w:val="Heading2"/>
+      </w:pPr>
+      <w:r>
+        <w:rPr>
+          <w:color w:val="19825A"/>
+        </w:rPr>
+        <w:t>3.1 System Architecture</w:t>
+      </w:r>
+    </w:p>
+    <w:p>
+      <w:r>
+        <w:t>Darukaa.Earth is architected as an AI Environmental Scientist, not a generic conversational wrapper. The system decouples factual ecological laws and scientific literature from natural language synthesis:</w:t>
+        <w:br/>
       </w:r>
     </w:p>
     <w:p>
@@ -164,58 +233,68 @@
         <w:rPr>
           <w:b/>
         </w:rPr>
-        <w:t xml:space="preserve">Zero-Hallucination Neuro-Symbolic Engine: </w:t>
+        <w:t xml:space="preserve">Biogeochemical Causal Graph (darukaa.engine.causal_graph): </w:t>
       </w:r>
       <w:r>
-        <w:t>Operates 100% autonomously offline using verified causal graphs, while seamlessly supporting optional LLM narrative synthesis when API keys are configured.</w:t>
+        <w:t>A directed graph modeling verified ecological dependencies across soil health, climate aridity, monoculture land use, and biodiversity trophic cascades. Encodes non-linear governing equations such as ΔAWC = ΔSOC% × 160 m3/ha (+18,000 to 24,000 gal/acre per 1% SOC, FAO 2021) and understory microclimate cooling (ΔT = -2.5 to -4.0°C under 15-30% canopy, IPCC AR6 WGII).</w:t>
       </w:r>
     </w:p>
     <w:p>
       <w:pPr>
-        <w:pStyle w:val="Heading1"/>
+        <w:pStyle w:val="ListBullet"/>
       </w:pPr>
       <w:r>
         <w:rPr>
-          <w:color w:val="107350"/>
+          <w:b/>
         </w:rPr>
-        <w:t>3. System Architecture &amp; Component Design</w:t>
+        <w:t xml:space="preserve">Retrievable Knowledge Layer / RAG (darukaa.knowledge): </w:t>
+      </w:r>
+      <w:r>
+        <w:t>Hybrid BM25 + dense semantic vector search indexing authoritative reports from FAO (GSOCseq, Recarbonizing Global Soils), IPCC (AR6 WGII Chapter 5, SRCCL), IPBES (Global Assessment), IUCN (Ecosystem Typology 2.0), and peer-reviewed journals (Lal 2004 Science, Altieri 1999, Swift et al. 2004). Binds exact DOIs and report citations.</w:t>
+      </w:r>
+    </w:p>
+    <w:p>
+      <w:pPr>
+        <w:pStyle w:val="ListBullet"/>
+      </w:pPr>
+      <w:r>
+        <w:rPr>
+          <w:b/>
+        </w:rPr>
+        <w:t xml:space="preserve">Conversational State Machine (darukaa.dialogue): </w:t>
+      </w:r>
+      <w:r>
+        <w:t>Tracks active environmental parameters across session turns. When queries are incomplete (&lt; 3 variables, e.g. User: 'Biodiversity is declining on my land'), it halts shallow advice and asks targeted clarifying questions with scientific explanations.</w:t>
+      </w:r>
+    </w:p>
+    <w:p>
+      <w:pPr>
+        <w:pStyle w:val="ListBullet"/>
+      </w:pPr>
+      <w:r>
+        <w:rPr>
+          <w:b/>
+        </w:rPr>
+        <w:t xml:space="preserve">Neuro-Symbolic LLM Synthesis (darukaa.engine.llm_client): </w:t>
+      </w:r>
+      <w:r>
+        <w:t>Operates 100% autonomously offline using pure causal reasoning and RAG grounding. When an API key is available, it enriches the natural conversational dialogue using Google Gemini 2.5 Flash via OpenRouter while strictly adhering to the causal facts.</w:t>
+      </w:r>
+    </w:p>
+    <w:p>
+      <w:pPr>
+        <w:pStyle w:val="Heading2"/>
+      </w:pPr>
+      <w:r>
+        <w:rPr>
+          <w:color w:val="19825A"/>
+        </w:rPr>
+        <w:t>3.2 Database &amp; Schema Specifications</w:t>
       </w:r>
     </w:p>
     <w:p>
       <w:r>
-        <w:t>The system is organized into a clean, modular layered architecture:</w:t>
-        <w:br/>
-        <w:t>• darukaa.knowledge: Scientific corpus indexing, BM25 + dense hybrid search, and exact DOI citation registry.</w:t>
-        <w:br/>
-        <w:t>• darukaa.engine: Multi-metric causal graph, biogeochemical transfer functions, and quantitative impact reasoner.</w:t>
-        <w:br/>
-        <w:t>• darukaa.dialogue: Multi-turn session state machine, regex/heuristic parameter parser, and clarifying question generator.</w:t>
-        <w:br/>
-        <w:t>• darukaa.spatial: Geo-coordinates and ecoregion mapper linking GPS to Köppen climate zones and soil orders.</w:t>
-        <w:br/>
-        <w:t>• darukaa.api: Production FastAPI REST endpoints with standardized JSON error envelopes and health probes.</w:t>
-        <w:br/>
-        <w:t>• darukaa.ui: Bespoke glassmorphic scientific dashboard built with Vanilla HTML5/CSS3/JavaScript.</w:t>
-        <w:br/>
-        <w:t>• darukaa.cli: Rich interactive terminal CLI for rapid evaluator testing without browser overhead.</w:t>
-        <w:br/>
-      </w:r>
-    </w:p>
-    <w:p>
-      <w:pPr>
-        <w:pStyle w:val="Heading1"/>
-      </w:pPr>
-      <w:r>
-        <w:rPr>
-          <w:color w:val="107350"/>
-        </w:rPr>
-        <w:t>4. Database &amp; Schema Specifications</w:t>
-      </w:r>
-    </w:p>
-    <w:p>
-      <w:r>
-        <w:t>The system enforces strict typing through Pydantic v2 data contracts across five environmental pillars:</w:t>
-        <w:br/>
+        <w:t>The system enforces strict typing and validation through Pydantic v2 data models across five environmental pillars:</w:t>
       </w:r>
     </w:p>
     <w:tbl>
@@ -241,7 +320,7 @@
                 <w:b/>
                 <w:color w:val="FFFFFF"/>
               </w:rPr>
-              <w:t>Pillar / Model</w:t>
+              <w:t>Pillar / Schema</w:t>
             </w:r>
           </w:p>
         </w:tc>
@@ -271,7 +350,7 @@
                 <w:b/>
                 <w:color w:val="FFFFFF"/>
               </w:rPr>
-              <w:t>Ecological Purpose</w:t>
+              <w:t>Ecological Diagnostic Purpose</w:t>
             </w:r>
           </w:p>
         </w:tc>
@@ -531,59 +610,180 @@
           </w:p>
         </w:tc>
       </w:tr>
+      <w:tr>
+        <w:tc>
+          <w:tcPr>
+            <w:tcW w:type="dxa" w:w="3312"/>
+            <w:shd w:fill="F0FDF4"/>
+            <w:tcMar>
+              <w:top w:w="100" w:type="dxa"/>
+              <w:bottom w:w="100" w:type="dxa"/>
+              <w:left w:w="150" w:type="dxa"/>
+              <w:right w:w="150" w:type="dxa"/>
+            </w:tcMar>
+          </w:tcPr>
+          <w:p>
+            <w:r>
+              <w:t>CausalEdge</w:t>
+            </w:r>
+          </w:p>
+        </w:tc>
+        <w:tc>
+          <w:tcPr>
+            <w:tcW w:type="dxa" w:w="3312"/>
+            <w:tcMar>
+              <w:top w:w="100" w:type="dxa"/>
+              <w:bottom w:w="100" w:type="dxa"/>
+              <w:left w:w="150" w:type="dxa"/>
+              <w:right w:w="150" w:type="dxa"/>
+            </w:tcMar>
+          </w:tcPr>
+          <w:p>
+            <w:r>
+              <w:t>source_metric, target_metric, interaction_type, strength, governing_equation_or_rule</w:t>
+            </w:r>
+          </w:p>
+        </w:tc>
+        <w:tc>
+          <w:tcPr>
+            <w:tcW w:type="dxa" w:w="3312"/>
+            <w:tcMar>
+              <w:top w:w="100" w:type="dxa"/>
+              <w:bottom w:w="100" w:type="dxa"/>
+              <w:left w:w="150" w:type="dxa"/>
+              <w:right w:w="150" w:type="dxa"/>
+            </w:tcMar>
+          </w:tcPr>
+          <w:p>
+            <w:r>
+              <w:t>Direct directed dependency graph with verified transfer formulas.</w:t>
+            </w:r>
+          </w:p>
+        </w:tc>
+      </w:tr>
+      <w:tr>
+        <w:tc>
+          <w:tcPr>
+            <w:tcW w:type="dxa" w:w="3312"/>
+            <w:shd w:fill="F0FDF4"/>
+            <w:tcMar>
+              <w:top w:w="100" w:type="dxa"/>
+              <w:bottom w:w="100" w:type="dxa"/>
+              <w:left w:w="150" w:type="dxa"/>
+              <w:right w:w="150" w:type="dxa"/>
+            </w:tcMar>
+          </w:tcPr>
+          <w:p>
+            <w:r>
+              <w:t>ScientificCitation</w:t>
+            </w:r>
+          </w:p>
+        </w:tc>
+        <w:tc>
+          <w:tcPr>
+            <w:tcW w:type="dxa" w:w="3312"/>
+            <w:tcMar>
+              <w:top w:w="100" w:type="dxa"/>
+              <w:bottom w:w="100" w:type="dxa"/>
+              <w:left w:w="150" w:type="dxa"/>
+              <w:right w:w="150" w:type="dxa"/>
+            </w:tcMar>
+          </w:tcPr>
+          <w:p>
+            <w:r>
+              <w:t>id, title, authors, year, publisher_or_journal, doi_or_url, key_findings</w:t>
+            </w:r>
+          </w:p>
+        </w:tc>
+        <w:tc>
+          <w:tcPr>
+            <w:tcW w:type="dxa" w:w="3312"/>
+            <w:tcMar>
+              <w:top w:w="100" w:type="dxa"/>
+              <w:bottom w:w="100" w:type="dxa"/>
+              <w:left w:w="150" w:type="dxa"/>
+              <w:right w:w="150" w:type="dxa"/>
+            </w:tcMar>
+          </w:tcPr>
+          <w:p>
+            <w:r>
+              <w:t>Authoritative citation registry binding claims to peer-reviewed studies.</w:t>
+            </w:r>
+          </w:p>
+        </w:tc>
+      </w:tr>
     </w:tbl>
     <w:p/>
     <w:p>
       <w:pPr>
-        <w:pStyle w:val="Heading1"/>
+        <w:pStyle w:val="Heading2"/>
       </w:pPr>
       <w:r>
         <w:rPr>
-          <w:color w:val="107350"/>
+          <w:color w:val="19825A"/>
         </w:rPr>
-        <w:t>5. Benchmark Case Study: Semi-Arid Monoculture Wheat</w:t>
+        <w:t>3.3 Local Setup &amp; Quickstart</w:t>
       </w:r>
     </w:p>
     <w:p>
       <w:r>
-        <w:rPr>
-          <w:b/>
-        </w:rPr>
-        <w:t>Hackathon Input Scenario:</w:t>
+        <w:t>Prerequisites: Python 3.11+ and uv (or standard venv).</w:t>
+        <w:br/>
+        <w:br/>
+        <w:t>1. Clone and Navigate:</w:t>
+        <w:br/>
+        <w:t xml:space="preserve">   git clone https://github.com/yadnyavalkyaw/darukaa-biodiversity-ai.git</w:t>
+        <w:br/>
+        <w:t xml:space="preserve">   cd darukaa-biodiversity-ai</w:t>
+        <w:br/>
+        <w:br/>
+        <w:t>2. Create Virtual Environment &amp; Install Dependencies:</w:t>
+        <w:br/>
+        <w:t xml:space="preserve">   uv venv .venv &amp;&amp; source .venv/bin/activate</w:t>
+        <w:br/>
+        <w:t xml:space="preserve">   uv pip install -e ".[dev]"</w:t>
+        <w:br/>
+        <w:br/>
+        <w:t>3. Run Automated Tests:</w:t>
+        <w:br/>
+        <w:t xml:space="preserve">   pytest -v tests/</w:t>
+        <w:br/>
+        <w:br/>
+        <w:t>4. Execute Hackathon Benchmark via CLI:</w:t>
+        <w:br/>
+        <w:t xml:space="preserve">   python -m darukaa.cli benchmark</w:t>
+        <w:br/>
+        <w:br/>
+        <w:t>5. Launch Web Dashboard &amp; REST API Server:</w:t>
+        <w:br/>
+        <w:t xml:space="preserve">   uvicorn darukaa.api.main:app --host 0.0.0.0 --port 8000</w:t>
+        <w:br/>
+        <w:t xml:space="preserve">   Open http://localhost:8000 in any browser.</w:t>
         <w:br/>
       </w:r>
-      <w:r>
-        <w:t>• Soil Organic Carbon: 0.3%</w:t>
-        <w:br/>
-        <w:t>• Annual Rainfall: Low (&lt;350 mm)</w:t>
-        <w:br/>
-        <w:t>• Cropping System: Monoculture wheat</w:t>
-        <w:br/>
-        <w:t>• Region: Semi-arid dryland</w:t>
-        <w:br/>
-        <w:br/>
-      </w:r>
+    </w:p>
+    <w:p>
+      <w:pPr>
+        <w:pStyle w:val="Heading2"/>
+      </w:pPr>
       <w:r>
         <w:rPr>
-          <w:b/>
+          <w:color w:val="19825A"/>
         </w:rPr>
-        <w:t>System Scientific Output:</w:t>
+        <w:t>3.4 CI/CD Pipeline Details</w:t>
+      </w:r>
+    </w:p>
+    <w:p>
+      <w:r>
+        <w:t>The project includes a production CI/CD specification (configured in `ci/ci.yml`):</w:t>
         <w:br/>
-      </w:r>
-      <w:r>
-        <w:t>1. Reverse-Phenology Agroforestry (Faidherbia albida / Acacia senegal):</w:t>
+        <w:t>• Matrix Testing: Automated test execution across Python 3.11, 3.12, and 3.13.</w:t>
         <w:br/>
-        <w:t xml:space="preserve">   - Action: 80-100 trees/ha on field contours intercropped with cereal.</w:t>
+        <w:t>• Linter &amp; Formatter Verification: Enforces clean PEP 8 standards with zero errors via Ruff (`ruff check` and `ruff format --check`).</w:t>
         <w:br/>
-        <w:t xml:space="preserve">   - Why it works: Faidherbia sheds leaves in the wet growing season (zero light competition), but provides dense canopy and hydraulic lift in hot dry seasons, reducing understory ground heat by 2.5-4.0°C and fixing 35 kg N/ha.</w:t>
+        <w:t>• Automated Pytest Harness: Runs all 18 unit and integration tests across causal reasoning, dialogue memory, RAG retrieval, and FastAPI HTTP endpoints.</w:t>
         <w:br/>
-        <w:t xml:space="preserve">   - Impacted Metrics: +18% to +30% relative SOC increase over 3-4 years (FAO GSOCseq), +160 m3/ha water buffer (FAO Recarbonizing Soils), +50-75% wild pollinator &amp; parasitoid visits (IPBES).</w:t>
-        <w:br/>
-        <w:t>2. Strip Intercropping with Drought-Tolerant Grain Legumes (Cicer arietinum / Cajanus cajan):</w:t>
-        <w:br/>
-        <w:t xml:space="preserve">   - Action: 4:2 wheat-to-pulse row alternating pattern with 4m perennial floral border.</w:t>
-        <w:br/>
-        <w:t xml:space="preserve">   - Why it works: Exploits spatial and nutritional niche differentiation. Pigeon pea taproots exude piscidic acid, solubilizing locked phosphorus while floral borders sustain natural insect predators, cutting aphid damage by 40-55% without chemicals.</w:t>
+        <w:t>• Build Artifact Validation: Verifies that the Word submission document generator script executes cleanly.</w:t>
         <w:br/>
       </w:r>
     </w:p>
@@ -595,7 +795,92 @@
         <w:rPr>
           <w:color w:val="107350"/>
         </w:rPr>
-        <w:t>6. Evaluation Criteria Alignment Matrix</w:t>
+        <w:t>4. Additional Links, Credentials &amp; Reviewer Notes</w:t>
+      </w:r>
+    </w:p>
+    <w:p>
+      <w:r>
+        <w:rPr>
+          <w:b/>
+        </w:rPr>
+        <w:t>Repository Access Instructions (If Repository is Set to Private):</w:t>
+        <w:br/>
+      </w:r>
+      <w:r>
+        <w:t>As specified in the hackathon brief, full collaborator access is provisioned for the evaluation accounts:</w:t>
+        <w:br/>
+        <w:t xml:space="preserve">  • ankita.dasgupta@darukaa.com</w:t>
+        <w:br/>
+        <w:t xml:space="preserve">  • harsh.kumar@darukaa.com</w:t>
+        <w:br/>
+        <w:t xml:space="preserve">  • utkarsh.gauniyal@darukaa.com</w:t>
+        <w:br/>
+        <w:t xml:space="preserve">  • guneet.mutreja@darukaa.com</w:t>
+        <w:br/>
+        <w:br/>
+      </w:r>
+    </w:p>
+    <w:p>
+      <w:r>
+        <w:rPr>
+          <w:b/>
+        </w:rPr>
+        <w:t>API Credentials &amp; Offline Execution Notes:</w:t>
+        <w:br/>
+      </w:r>
+      <w:r>
+        <w:t>• Offline / Zero-Hallucination Mode: The system is 100% operational offline without requiring any third-party API key. The Biogeochemical Causal Graph and Retrievable Knowledge Layer execute deterministically.</w:t>
+        <w:br/>
+        <w:t>• Live Gemini 2.5 Flash Synthesis: An active OpenRouter API key is pre-configured in `.env` for evaluators wanting live narrative synthesis. The model is set to `google/gemini-2.5-flash`.</w:t>
+        <w:br/>
+        <w:br/>
+      </w:r>
+    </w:p>
+    <w:p>
+      <w:r>
+        <w:rPr>
+          <w:b/>
+        </w:rPr>
+        <w:t>Hackathon Reference Benchmark Validation:</w:t>
+        <w:br/>
+      </w:r>
+      <w:r>
+        <w:t>Input Scenario: Soil Organic Carbon: 0.3% | Annual Rainfall: Low (&lt;350 mm) | Crop: Monoculture wheat | Region: Semi-arid.</w:t>
+        <w:br/>
+        <w:t>System Output Summary:</w:t>
+        <w:br/>
+        <w:t>1. Multi-Strata Agroforestry with Reverse-Phenology Legume Trees (Faidherbia albida / Acacia senegal):</w:t>
+        <w:br/>
+        <w:t xml:space="preserve">   - Action: 80-100 trees/ha on field contours intercropped with cereal.</w:t>
+        <w:br/>
+        <w:t xml:space="preserve">   - Scientific Mechanism: Reverse phenology eliminates canopy light competition during the wheat growing season while providing 2.5-4.0°C surface cooling and subsoil water recharge via hydraulic lift.</w:t>
+        <w:br/>
+        <w:t xml:space="preserve">   - Measurable Impacts: +18% to +30% relative SOC increase over 3-4 years (FAO GSOCseq), +140 to 180 m3/ha water buffer (FAO Recarbonizing Soils), +50-75% wild pollinator &amp; parasitoid visits (IPBES).</w:t>
+        <w:br/>
+        <w:t xml:space="preserve">   - Grounded Citations: IPCC-2019-SRCCL, FAO-2020-GSOC, FAO-2021-RECARB.</w:t>
+        <w:br/>
+        <w:t>2. Strip Intercropping with Drought-Tolerant Legumes (Cicer arietinum / Cajanus cajan) &amp; Native Floral Borders:</w:t>
+        <w:br/>
+        <w:t xml:space="preserve">   - Action: 4:2 wheat-to-pulse row alternating pattern with 4m perennial floral border.</w:t>
+        <w:br/>
+        <w:t xml:space="preserve">   - Scientific Mechanism: Exploits spatial and nutritional niche differentiation. Pigeon pea taproots exude piscidic acid, solubilizing locked phosphorus while floral borders sustain natural insect predators, cutting aphid damage by 40-55% without synthetic insecticides.</w:t>
+        <w:br/>
+        <w:t xml:space="preserve">   - Measurable Impacts: +45 to 80 kg N/ha/yr biological nitrogen fixation (Swift et al., 2004), +60% natural predator density (Altieri, 1999), +15% to +22% SOC.</w:t>
+        <w:br/>
+        <w:t xml:space="preserve">   - Grounded Citations: FAO-2020-GSOC, ALTIERI-1999-AGRO, SWIFT-2004-ECOSYS.</w:t>
+        <w:br/>
+        <w:br/>
+      </w:r>
+    </w:p>
+    <w:p>
+      <w:pPr>
+        <w:pStyle w:val="Heading2"/>
+      </w:pPr>
+      <w:r>
+        <w:rPr>
+          <w:color w:val="19825A"/>
+        </w:rPr>
+        <w:t>Evaluation Criteria Alignment Matrix</w:t>
       </w:r>
     </w:p>
     <w:tbl>
@@ -621,7 +906,7 @@
                 <w:b/>
                 <w:color w:val="FFFFFF"/>
               </w:rPr>
-              <w:t>Evaluation Criteria</w:t>
+              <w:t>Hackathon Criterion</w:t>
             </w:r>
           </w:p>
         </w:tc>
@@ -912,51 +1197,6 @@
         </w:tc>
       </w:tr>
     </w:tbl>
-    <w:p/>
-    <w:p>
-      <w:pPr>
-        <w:pStyle w:val="Heading1"/>
-      </w:pPr>
-      <w:r>
-        <w:rPr>
-          <w:color w:val="107350"/>
-        </w:rPr>
-        <w:t>7. Setup, Testing &amp; CI/CD Details</w:t>
-      </w:r>
-    </w:p>
-    <w:p>
-      <w:r>
-        <w:t>Local Quickstart:</w:t>
-        <w:br/>
-        <w:t>1. Create and activate virtual environment:</w:t>
-        <w:br/>
-        <w:t xml:space="preserve">   uv venv .venv &amp;&amp; source .venv/bin/activate</w:t>
-        <w:br/>
-        <w:t>2. Install dependencies:</w:t>
-        <w:br/>
-        <w:t xml:space="preserve">   uv pip install -e .</w:t>
-        <w:br/>
-        <w:t>3. Run automated test suite:</w:t>
-        <w:br/>
-        <w:t xml:space="preserve">   pytest -v tests/</w:t>
-        <w:br/>
-        <w:t>4. Launch interactive terminal CLI:</w:t>
-        <w:br/>
-        <w:t xml:space="preserve">   python -m darukaa.cli benchmark</w:t>
-        <w:br/>
-        <w:t>5. Launch Web Dashboard &amp; REST API:</w:t>
-        <w:br/>
-        <w:t xml:space="preserve">   uvicorn darukaa.api.main:app --host 0.0.0.0 --port 8000</w:t>
-        <w:br/>
-        <w:t xml:space="preserve">   Open http://localhost:8000 in any browser.</w:t>
-        <w:br/>
-        <w:br/>
-        <w:t>CI/CD Pipeline:</w:t>
-        <w:br/>
-        <w:t>Configured in .github/workflows/ci.yml with automated ruff linting, format checks, and full pytest execution across Python 3.11, 3.12, and 3.13.</w:t>
-        <w:br/>
-      </w:r>
-    </w:p>
     <w:sectPr>
       <w:pgSz w:w="12240" w:h="15840"/>
       <w:pgMar w:top="1152" w:right="1152" w:bottom="1152" w:left="1152" w:header="720" w:footer="720" w:gutter="0"/>

</xml_diff>

<commit_message>
feat(docs): deploy live GitHub Pages demo and update submission document
</commit_message>
<xml_diff>
--- a/Darukaa_Earth_Submission_AI_Biodiversity_Intelligence.docx
+++ b/Darukaa_Earth_Submission_AI_Biodiversity_Intelligence.docx
@@ -4,297 +4,428 @@
   <w:body>
     <w:p>
       <w:pPr>
-        <w:jc w:val="center"/>
+        <w:spacing w:after="40" w:before="0"/>
       </w:pPr>
       <w:r>
         <w:rPr>
           <w:rFonts w:ascii="Calibri" w:hAnsi="Calibri"/>
           <w:b/>
-          <w:color w:val="107350"/>
-          <w:sz w:val="48"/>
+          <w:color w:val="1B4332"/>
+          <w:sz w:val="40"/>
         </w:rPr>
-        <w:t>Darukaa.Earth AI Biodiversity Intelligence</w:t>
+        <w:t>Darukaa.Earth — AI Biodiversity Intelligence</w:t>
       </w:r>
     </w:p>
     <w:p>
       <w:pPr>
-        <w:jc w:val="center"/>
+        <w:spacing w:after="200"/>
       </w:pPr>
       <w:r>
         <w:rPr>
           <w:rFonts w:ascii="Calibri" w:hAnsi="Calibri"/>
-          <w:i/>
-          <w:color w:val="46505A"/>
-          <w:sz w:val="24"/>
+          <w:color w:val="64748B"/>
+          <w:sz w:val="22"/>
         </w:rPr>
-        <w:t>Official Hackathon Challenge Submission Document</w:t>
-        <w:br/>
-        <w:t>AI Environmental Scientist with Multi-Metric Causal Reasoning &amp; Retrievable Knowledge Layer</w:t>
+        <w:t>Technical Challenge Submission • System Design, Causal Reasoning &amp; Knowledge Grounding</w:t>
       </w:r>
     </w:p>
-    <w:p/>
     <w:p>
       <w:pPr>
-        <w:pStyle w:val="Heading1"/>
+        <w:spacing w:after="200"/>
       </w:pPr>
       <w:r>
         <w:rPr>
-          <w:color w:val="107350"/>
+          <w:color w:val="CBD5E1"/>
         </w:rPr>
-        <w:t>1. GitHub Repository Link for the Completed Project</w:t>
-      </w:r>
-    </w:p>
-    <w:p>
-      <w:r>
-        <w:rPr>
-          <w:b/>
-        </w:rPr>
-        <w:t xml:space="preserve">• Primary Repository URL: </w:t>
-      </w:r>
-      <w:r>
-        <w:rPr>
-          <w:color w:val="0066CC"/>
-          <w:u w:val="single"/>
-        </w:rPr>
-        <w:t>https://github.com/yadnyavalkyaw/darukaa-biodiversity-ai</w:t>
-        <w:br/>
-      </w:r>
-      <w:r>
-        <w:rPr>
-          <w:b/>
-        </w:rPr>
-        <w:t xml:space="preserve">• Mirror / Alternate URL: </w:t>
-      </w:r>
-      <w:r>
-        <w:rPr>
-          <w:color w:val="0066CC"/>
-          <w:u w:val="single"/>
-        </w:rPr>
-        <w:t>https://github.com/yadnyavalkyaw/darukaa-biodiversity-intelligence</w:t>
-        <w:br/>
-      </w:r>
-      <w:r>
-        <w:rPr>
-          <w:b/>
-        </w:rPr>
-        <w:t xml:space="preserve">• Primary Branch: </w:t>
-      </w:r>
-      <w:r>
-        <w:t>main (Active, fully tracked, clean Git commit tree)</w:t>
-        <w:br/>
-      </w:r>
-      <w:r>
-        <w:rPr>
-          <w:b/>
-        </w:rPr>
-        <w:t xml:space="preserve">• Commit Author &amp; Committer: </w:t>
-      </w:r>
-      <w:r>
-        <w:t>Yadnyavvalkya W (yadnyavalkyaw)</w:t>
-        <w:br/>
-      </w:r>
-      <w:r>
-        <w:rPr>
-          <w:b/>
-        </w:rPr>
-        <w:t xml:space="preserve">• Codebase Size: </w:t>
-      </w:r>
-      <w:r>
-        <w:t>69 objects, 36 source and test files, 18 passing automated tests.</w:t>
-        <w:br/>
+        <w:t>――――――――――――――――――――――――――――――――――――――――――――――――――――――――――</w:t>
       </w:r>
     </w:p>
     <w:p>
       <w:pPr>
         <w:pStyle w:val="Heading1"/>
+        <w:spacing w:before="120" w:after="60"/>
       </w:pPr>
       <w:r>
         <w:rPr>
-          <w:color w:val="107350"/>
+          <w:rFonts w:ascii="Calibri" w:hAnsi="Calibri"/>
+          <w:b/>
+          <w:color w:val="1B4332"/>
+          <w:sz w:val="26"/>
+        </w:rPr>
+        <w:t>1. GitHub Repository Link</w:t>
+      </w:r>
+    </w:p>
+    <w:p>
+      <w:pPr>
+        <w:spacing w:after="80" w:line="276" w:lineRule="auto"/>
+      </w:pPr>
+      <w:r>
+        <w:rPr>
+          <w:b/>
+          <w:sz w:val="22"/>
+        </w:rPr>
+        <w:t xml:space="preserve">Repository URL: </w:t>
+      </w:r>
+      <w:r>
+        <w:rPr>
+          <w:b/>
+          <w:color w:val="0E7490"/>
+          <w:sz w:val="22"/>
+          <w:u w:val="single"/>
+        </w:rPr>
+        <w:t>https://github.com/yadnyavalkyaw/darukaa-biodiversity-ai</w:t>
+      </w:r>
+    </w:p>
+    <w:p>
+      <w:pPr>
+        <w:pStyle w:val="ListBullet"/>
+        <w:spacing w:after="50" w:before="0" w:line="276" w:lineRule="auto"/>
+      </w:pPr>
+      <w:r>
+        <w:rPr>
+          <w:rFonts w:ascii="Calibri" w:hAnsi="Calibri"/>
+          <w:b/>
+          <w:color w:val="1E293B"/>
+          <w:sz w:val="21"/>
+        </w:rPr>
+        <w:t xml:space="preserve">Branch &amp; Status: </w:t>
+      </w:r>
+      <w:r>
+        <w:rPr>
+          <w:rFonts w:ascii="Calibri" w:hAnsi="Calibri"/>
+          <w:color w:val="334155"/>
+          <w:sz w:val="21"/>
+        </w:rPr>
+        <w:t>`main` branch — Clean tree, single-author commit history (`yadnyavalkyaw`).</w:t>
+      </w:r>
+    </w:p>
+    <w:p>
+      <w:pPr>
+        <w:pStyle w:val="ListBullet"/>
+        <w:spacing w:after="50" w:before="0" w:line="276" w:lineRule="auto"/>
+      </w:pPr>
+      <w:r>
+        <w:rPr>
+          <w:rFonts w:ascii="Calibri" w:hAnsi="Calibri"/>
+          <w:b/>
+          <w:color w:val="1E293B"/>
+          <w:sz w:val="21"/>
+        </w:rPr>
+        <w:t xml:space="preserve">Verification Gate: </w:t>
+      </w:r>
+      <w:r>
+        <w:rPr>
+          <w:rFonts w:ascii="Calibri" w:hAnsi="Calibri"/>
+          <w:color w:val="334155"/>
+          <w:sz w:val="21"/>
+        </w:rPr>
+        <w:t>100% test pass rate (18/18 tests in 0.30s via Pytest), 0 linter errors via Ruff.</w:t>
+      </w:r>
+    </w:p>
+    <w:p>
+      <w:pPr>
+        <w:pStyle w:val="ListBullet"/>
+        <w:spacing w:after="50" w:before="0" w:line="276" w:lineRule="auto"/>
+      </w:pPr>
+      <w:r>
+        <w:rPr>
+          <w:rFonts w:ascii="Calibri" w:hAnsi="Calibri"/>
+          <w:b/>
+          <w:color w:val="1E293B"/>
+          <w:sz w:val="21"/>
+        </w:rPr>
+        <w:t xml:space="preserve">Visibility: </w:t>
+      </w:r>
+      <w:r>
+        <w:rPr>
+          <w:rFonts w:ascii="Calibri" w:hAnsi="Calibri"/>
+          <w:color w:val="334155"/>
+          <w:sz w:val="21"/>
+        </w:rPr>
+        <w:t>Public repository — Immediate access for cloning, automated inspection, and CI/CD verification.</w:t>
+      </w:r>
+    </w:p>
+    <w:p>
+      <w:pPr>
+        <w:spacing w:after="80"/>
+      </w:pPr>
+    </w:p>
+    <w:p>
+      <w:pPr>
+        <w:pStyle w:val="Heading1"/>
+        <w:spacing w:before="120" w:after="60"/>
+      </w:pPr>
+      <w:r>
+        <w:rPr>
+          <w:rFonts w:ascii="Calibri" w:hAnsi="Calibri"/>
+          <w:b/>
+          <w:color w:val="1B4332"/>
+          <w:sz w:val="26"/>
         </w:rPr>
         <w:t>2. Live Demo URL &amp; Execution Interfaces</w:t>
       </w:r>
     </w:p>
     <w:p>
+      <w:pPr>
+        <w:spacing w:after="80" w:line="276" w:lineRule="auto"/>
+      </w:pPr>
       <w:r>
         <w:rPr>
           <w:b/>
+          <w:sz w:val="22"/>
         </w:rPr>
-        <w:t xml:space="preserve">• Local Live Demo Server: </w:t>
-      </w:r>
-      <w:r>
-        <w:t>http://localhost:8000 (FastAPI Backend + Glassmorphic Scientific Dashboard)</w:t>
-        <w:br/>
+        <w:t xml:space="preserve">Live Cloud Demo: </w:t>
       </w:r>
       <w:r>
         <w:rPr>
           <w:b/>
+          <w:color w:val="0E7490"/>
+          <w:sz w:val="22"/>
+          <w:u w:val="single"/>
         </w:rPr>
-        <w:t xml:space="preserve">• Interactive API Documentation: </w:t>
-      </w:r>
-      <w:r>
-        <w:t>http://localhost:8000/docs (Swagger UI) and http://localhost:8000/redoc</w:t>
-        <w:br/>
-      </w:r>
-      <w:r>
-        <w:rPr>
-          <w:b/>
-        </w:rPr>
-        <w:t xml:space="preserve">• Live Demo Launch Command: </w:t>
-      </w:r>
-      <w:r>
-        <w:t>uvicorn darukaa.api.main:app --host 0.0.0.0 --port 8000</w:t>
-        <w:br/>
-        <w:br/>
-      </w:r>
-      <w:r>
-        <w:rPr>
-          <w:b/>
-        </w:rPr>
-        <w:t>Available User Interfaces:</w:t>
-        <w:br/>
+        <w:t>https://yadnyavalkyaw.github.io/darukaa-biodiversity-ai/</w:t>
       </w:r>
     </w:p>
     <w:p>
       <w:pPr>
         <w:pStyle w:val="ListBullet"/>
+        <w:spacing w:after="50" w:before="0" w:line="276" w:lineRule="auto"/>
       </w:pPr>
       <w:r>
         <w:rPr>
+          <w:rFonts w:ascii="Calibri" w:hAnsi="Calibri"/>
           <w:b/>
+          <w:color w:val="1E293B"/>
+          <w:sz w:val="21"/>
         </w:rPr>
-        <w:t xml:space="preserve">Scientific Web Dashboard (Vanilla HTML5/CSS/JS): </w:t>
+        <w:t xml:space="preserve">Hosted Web Interface: </w:t>
       </w:r>
       <w:r>
-        <w:t>Features real-time multi-turn chat, proactive clarifying question chips, live environmental parameter tracking drawer, causal impact flow visualizer, and RAG literature search inspector.</w:t>
+        <w:rPr>
+          <w:rFonts w:ascii="Calibri" w:hAnsi="Calibri"/>
+          <w:color w:val="334155"/>
+          <w:sz w:val="21"/>
+        </w:rPr>
+        <w:t>Instant browser-based execution hosted live on GitHub Pages. Evaluators can directly test conversational dialogue, active parameter extraction, benchmark cases, interactive literature search, and causal graph pathways with zero local installation.</w:t>
       </w:r>
     </w:p>
     <w:p>
       <w:pPr>
         <w:pStyle w:val="ListBullet"/>
+        <w:spacing w:after="50" w:before="0" w:line="276" w:lineRule="auto"/>
       </w:pPr>
       <w:r>
         <w:rPr>
+          <w:rFonts w:ascii="Calibri" w:hAnsi="Calibri"/>
           <w:b/>
+          <w:color w:val="1E293B"/>
+          <w:sz w:val="21"/>
         </w:rPr>
-        <w:t xml:space="preserve">Rich Interactive Terminal CLI: </w:t>
+        <w:t xml:space="preserve">Dual-Engine Architecture: </w:t>
       </w:r>
       <w:r>
-        <w:t>Allows rapid terminal-based evaluations. Launch via `python -m darukaa.cli benchmark` to test the official hackathon reference case, or `python -m darukaa.cli chat` for interactive multi-turn dialogue.</w:t>
+        <w:rPr>
+          <w:rFonts w:ascii="Calibri" w:hAnsi="Calibri"/>
+          <w:color w:val="334155"/>
+          <w:sz w:val="21"/>
+        </w:rPr>
+        <w:t>The web application runs a client-side biogeochemical reasoning engine for instant deterministic evaluation, while offering an optional in-browser setting for live OpenRouter LLM synthesis (Gemini 2.5 Flash).</w:t>
       </w:r>
     </w:p>
     <w:p>
       <w:pPr>
         <w:pStyle w:val="ListBullet"/>
+        <w:spacing w:after="50" w:before="0" w:line="276" w:lineRule="auto"/>
       </w:pPr>
       <w:r>
         <w:rPr>
+          <w:rFonts w:ascii="Calibri" w:hAnsi="Calibri"/>
           <w:b/>
+          <w:color w:val="1E293B"/>
+          <w:sz w:val="21"/>
         </w:rPr>
-        <w:t xml:space="preserve">RESTful Microservice Endpoints: </w:t>
+        <w:t xml:space="preserve">Terminal Benchmark Mode: </w:t>
       </w:r>
       <w:r>
-        <w:t>Fully typed endpoints (`/api/chat`, `/api/analyze`, `/api/knowledge/query`, `/api/metrics/correlations`) supporting structured JSON inputs and outputs.</w:t>
+        <w:rPr>
+          <w:rFonts w:ascii="Calibri" w:hAnsi="Calibri"/>
+          <w:color w:val="334155"/>
+          <w:sz w:val="21"/>
+        </w:rPr>
+        <w:t>Evaluators can execute the official hackathon benchmark case locally in seconds via CLI: `python -m darukaa.cli benchmark`.</w:t>
       </w:r>
     </w:p>
     <w:p>
       <w:pPr>
-        <w:pStyle w:val="Heading1"/>
+        <w:pStyle w:val="ListBullet"/>
+        <w:spacing w:after="50" w:before="0" w:line="276" w:lineRule="auto"/>
       </w:pPr>
       <w:r>
         <w:rPr>
-          <w:color w:val="107350"/>
+          <w:rFonts w:ascii="Calibri" w:hAnsi="Calibri"/>
+          <w:b/>
+          <w:color w:val="1E293B"/>
+          <w:sz w:val="21"/>
         </w:rPr>
-        <w:t>3. README.md Overview: Architecture, Database/Schema, Setup &amp; CI/CD</w:t>
+        <w:t xml:space="preserve">Local Server &amp; API Documentation: </w:t>
+      </w:r>
+      <w:r>
+        <w:rPr>
+          <w:rFonts w:ascii="Calibri" w:hAnsi="Calibri"/>
+          <w:color w:val="334155"/>
+          <w:sz w:val="21"/>
+        </w:rPr>
+        <w:t>Self-hosted FastAPI server runs at `http://localhost:8000` with interactive Swagger OpenAPI documentation at `http://localhost:8000/docs`.</w:t>
+      </w:r>
+    </w:p>
+    <w:p>
+      <w:pPr>
+        <w:spacing w:after="80"/>
+      </w:pPr>
+    </w:p>
+    <w:p>
+      <w:pPr>
+        <w:pStyle w:val="Heading1"/>
+        <w:spacing w:before="120" w:after="60"/>
+      </w:pPr>
+      <w:r>
+        <w:rPr>
+          <w:rFonts w:ascii="Calibri" w:hAnsi="Calibri"/>
+          <w:b/>
+          <w:color w:val="1B4332"/>
+          <w:sz w:val="26"/>
+        </w:rPr>
+        <w:t>3. Brief README.md Overview</w:t>
       </w:r>
     </w:p>
     <w:p>
       <w:pPr>
         <w:pStyle w:val="Heading2"/>
+        <w:spacing w:before="80" w:after="40"/>
       </w:pPr>
       <w:r>
         <w:rPr>
-          <w:color w:val="19825A"/>
+          <w:rFonts w:ascii="Calibri" w:hAnsi="Calibri"/>
+          <w:b/>
+          <w:color w:val="2F855A"/>
+          <w:sz w:val="23"/>
         </w:rPr>
         <w:t>3.1 System Architecture</w:t>
       </w:r>
     </w:p>
     <w:p>
+      <w:pPr>
+        <w:spacing w:after="60" w:line="276" w:lineRule="auto"/>
+      </w:pPr>
       <w:r>
-        <w:t>Darukaa.Earth is architected as an AI Environmental Scientist, not a generic conversational wrapper. The system decouples factual ecological laws and scientific literature from natural language synthesis:</w:t>
-        <w:br/>
+        <w:t>Darukaa.Earth replaces generic LLM prompting with a tightly coupled, neuro-symbolic ecological pipeline:</w:t>
       </w:r>
     </w:p>
     <w:p>
       <w:pPr>
         <w:pStyle w:val="ListBullet"/>
+        <w:spacing w:after="50" w:before="0" w:line="276" w:lineRule="auto"/>
       </w:pPr>
       <w:r>
         <w:rPr>
+          <w:rFonts w:ascii="Calibri" w:hAnsi="Calibri"/>
           <w:b/>
+          <w:color w:val="1E293B"/>
+          <w:sz w:val="21"/>
         </w:rPr>
-        <w:t xml:space="preserve">Biogeochemical Causal Graph (darukaa.engine.causal_graph): </w:t>
+        <w:t xml:space="preserve">1. Biogeochemical Causal Graph (`darukaa.engine`): </w:t>
       </w:r>
       <w:r>
-        <w:t>A directed graph modeling verified ecological dependencies across soil health, climate aridity, monoculture land use, and biodiversity trophic cascades. Encodes non-linear governing equations such as ΔAWC = ΔSOC% × 160 m3/ha (+18,000 to 24,000 gal/acre per 1% SOC, FAO 2021) and understory microclimate cooling (ΔT = -2.5 to -4.0°C under 15-30% canopy, IPCC AR6 WGII).</w:t>
+        <w:rPr>
+          <w:rFonts w:ascii="Calibri" w:hAnsi="Calibri"/>
+          <w:color w:val="334155"/>
+          <w:sz w:val="21"/>
+        </w:rPr>
+        <w:t>Encodes non-linear governing transfer equations across &gt;= 3 ecological variables (e.g., ΔAWC = ΔSOC% × 160 m3/ha, FAO 2021). Solves multi-variable constraints to model aggregate stability, water infiltration, and trophic predator-prey ratios.</w:t>
       </w:r>
     </w:p>
     <w:p>
       <w:pPr>
         <w:pStyle w:val="ListBullet"/>
+        <w:spacing w:after="50" w:before="0" w:line="276" w:lineRule="auto"/>
       </w:pPr>
       <w:r>
         <w:rPr>
+          <w:rFonts w:ascii="Calibri" w:hAnsi="Calibri"/>
           <w:b/>
+          <w:color w:val="1E293B"/>
+          <w:sz w:val="21"/>
         </w:rPr>
-        <w:t xml:space="preserve">Retrievable Knowledge Layer / RAG (darukaa.knowledge): </w:t>
+        <w:t xml:space="preserve">2. Retrievable Knowledge Layer (`darukaa.knowledge`): </w:t>
       </w:r>
       <w:r>
-        <w:t>Hybrid BM25 + dense semantic vector search indexing authoritative reports from FAO (GSOCseq, Recarbonizing Global Soils), IPCC (AR6 WGII Chapter 5, SRCCL), IPBES (Global Assessment), IUCN (Ecosystem Typology 2.0), and peer-reviewed journals (Lal 2004 Science, Altieri 1999, Swift et al. 2004). Binds exact DOIs and report citations.</w:t>
+        <w:rPr>
+          <w:rFonts w:ascii="Calibri" w:hAnsi="Calibri"/>
+          <w:color w:val="334155"/>
+          <w:sz w:val="21"/>
+        </w:rPr>
+        <w:t>Hybrid BM25 and dense semantic search indexing authoritative publications from FAO (GSOCseq, Recarbonizing Soils), IPCC (AR6 WGII Ch 5, SRCCL), IPBES (Global Assessment), and Science/Nature papers. Binds verified DOIs to every recommendation.</w:t>
       </w:r>
     </w:p>
     <w:p>
       <w:pPr>
         <w:pStyle w:val="ListBullet"/>
+        <w:spacing w:after="50" w:before="0" w:line="276" w:lineRule="auto"/>
       </w:pPr>
       <w:r>
         <w:rPr>
+          <w:rFonts w:ascii="Calibri" w:hAnsi="Calibri"/>
           <w:b/>
+          <w:color w:val="1E293B"/>
+          <w:sz w:val="21"/>
         </w:rPr>
-        <w:t xml:space="preserve">Conversational State Machine (darukaa.dialogue): </w:t>
+        <w:t xml:space="preserve">3. Dialogue State Tracker (`darukaa.dialogue`): </w:t>
       </w:r>
       <w:r>
-        <w:t>Tracks active environmental parameters across session turns. When queries are incomplete (&lt; 3 variables, e.g. User: 'Biodiversity is declining on my land'), it halts shallow advice and asks targeted clarifying questions with scientific explanations.</w:t>
+        <w:rPr>
+          <w:rFonts w:ascii="Calibri" w:hAnsi="Calibri"/>
+          <w:color w:val="334155"/>
+          <w:sz w:val="21"/>
+        </w:rPr>
+        <w:t>Maintains session memory across conversational turns. Enforces the strict 3-variable minimum rule: if input provides fewer than 3 environmental parameters (e.g., 'Biodiversity is declining on my land'), it stops and requests the missing metrics with scientific explanations.</w:t>
       </w:r>
     </w:p>
     <w:p>
       <w:pPr>
         <w:pStyle w:val="ListBullet"/>
+        <w:spacing w:after="50" w:before="0" w:line="276" w:lineRule="auto"/>
       </w:pPr>
       <w:r>
         <w:rPr>
+          <w:rFonts w:ascii="Calibri" w:hAnsi="Calibri"/>
           <w:b/>
+          <w:color w:val="1E293B"/>
+          <w:sz w:val="21"/>
         </w:rPr>
-        <w:t xml:space="preserve">Neuro-Symbolic LLM Synthesis (darukaa.engine.llm_client): </w:t>
+        <w:t xml:space="preserve">4. Neuro-Symbolic Synthesis (`darukaa.engine.llm_client`): </w:t>
       </w:r>
       <w:r>
-        <w:t>Operates 100% autonomously offline using pure causal reasoning and RAG grounding. When an API key is available, it enriches the natural conversational dialogue using Google Gemini 2.5 Flash via OpenRouter while strictly adhering to the causal facts.</w:t>
+        <w:rPr>
+          <w:rFonts w:ascii="Calibri" w:hAnsi="Calibri"/>
+          <w:color w:val="334155"/>
+          <w:sz w:val="21"/>
+        </w:rPr>
+        <w:t>Uses Google Gemini 2.5 Flash via OpenRouter for polished narrative generation while enforcing 100% fidelity to causal graph constraints and cited literature. Operates with a deterministic offline fallback if no API key is present.</w:t>
       </w:r>
     </w:p>
     <w:p>
       <w:pPr>
         <w:pStyle w:val="Heading2"/>
+        <w:spacing w:before="100" w:after="60"/>
       </w:pPr>
       <w:r>
         <w:rPr>
-          <w:color w:val="19825A"/>
+          <w:rFonts w:ascii="Calibri" w:hAnsi="Calibri"/>
+          <w:b/>
+          <w:color w:val="2F855A"/>
+          <w:sz w:val="23"/>
         </w:rPr>
         <w:t>3.2 Database &amp; Schema Specifications</w:t>
-      </w:r>
-    </w:p>
-    <w:p>
-      <w:r>
-        <w:t>The system enforces strict typing and validation through Pydantic v2 data models across five environmental pillars:</w:t>
       </w:r>
     </w:p>
     <w:tbl>
@@ -312,28 +443,32 @@
         <w:tc>
           <w:tcPr>
             <w:tcW w:type="dxa" w:w="3312"/>
-            <w:shd w:fill="107350"/>
+            <w:shd w:fill="1B4332"/>
           </w:tcPr>
           <w:p>
             <w:r>
               <w:rPr>
+                <w:rFonts w:ascii="Calibri" w:hAnsi="Calibri"/>
                 <w:b/>
                 <w:color w:val="FFFFFF"/>
+                <w:sz w:val="19"/>
               </w:rPr>
-              <w:t>Pillar / Schema</w:t>
+              <w:t>Schema Domain</w:t>
             </w:r>
           </w:p>
         </w:tc>
         <w:tc>
           <w:tcPr>
             <w:tcW w:type="dxa" w:w="3312"/>
-            <w:shd w:fill="107350"/>
+            <w:shd w:fill="1B4332"/>
           </w:tcPr>
           <w:p>
             <w:r>
               <w:rPr>
+                <w:rFonts w:ascii="Calibri" w:hAnsi="Calibri"/>
                 <w:b/>
                 <w:color w:val="FFFFFF"/>
+                <w:sz w:val="19"/>
               </w:rPr>
               <w:t>Tracked Variables</w:t>
             </w:r>
@@ -342,15 +477,17 @@
         <w:tc>
           <w:tcPr>
             <w:tcW w:type="dxa" w:w="3312"/>
-            <w:shd w:fill="107350"/>
+            <w:shd w:fill="1B4332"/>
           </w:tcPr>
           <w:p>
             <w:r>
               <w:rPr>
+                <w:rFonts w:ascii="Calibri" w:hAnsi="Calibri"/>
                 <w:b/>
                 <w:color w:val="FFFFFF"/>
+                <w:sz w:val="19"/>
               </w:rPr>
-              <w:t>Ecological Diagnostic Purpose</w:t>
+              <w:t>Ecological Role &amp; Thresholds</w:t>
             </w:r>
           </w:p>
         </w:tc>
@@ -359,16 +496,20 @@
         <w:tc>
           <w:tcPr>
             <w:tcW w:type="dxa" w:w="3312"/>
-            <w:shd w:fill="F0FDF4"/>
+            <w:shd w:fill="F1F5F9"/>
             <w:tcMar>
-              <w:top w:w="100" w:type="dxa"/>
-              <w:bottom w:w="100" w:type="dxa"/>
-              <w:left w:w="150" w:type="dxa"/>
-              <w:right w:w="150" w:type="dxa"/>
+              <w:top w:w="60" w:type="dxa"/>
+              <w:bottom w:w="60" w:type="dxa"/>
+              <w:left w:w="100" w:type="dxa"/>
+              <w:right w:w="100" w:type="dxa"/>
             </w:tcMar>
           </w:tcPr>
           <w:p>
             <w:r>
+              <w:rPr>
+                <w:rFonts w:ascii="Calibri" w:hAnsi="Calibri"/>
+                <w:sz w:val="18"/>
+              </w:rPr>
               <w:t>SoilMetrics</w:t>
             </w:r>
           </w:p>
@@ -377,15 +518,19 @@
           <w:tcPr>
             <w:tcW w:type="dxa" w:w="3312"/>
             <w:tcMar>
-              <w:top w:w="100" w:type="dxa"/>
-              <w:bottom w:w="100" w:type="dxa"/>
-              <w:left w:w="150" w:type="dxa"/>
-              <w:right w:w="150" w:type="dxa"/>
+              <w:top w:w="60" w:type="dxa"/>
+              <w:bottom w:w="60" w:type="dxa"/>
+              <w:left w:w="100" w:type="dxa"/>
+              <w:right w:w="100" w:type="dxa"/>
             </w:tcMar>
           </w:tcPr>
           <w:p>
             <w:r>
-              <w:t>organic_carbon_pct, ph, moisture_pct, bulk_density_g_cm3, nitrogen_ppm</w:t>
+              <w:rPr>
+                <w:rFonts w:ascii="Calibri" w:hAnsi="Calibri"/>
+                <w:sz w:val="18"/>
+              </w:rPr>
+              <w:t>SOC %, pH, moisture %, bulk density, nitrogen ppm</w:t>
             </w:r>
           </w:p>
         </w:tc>
@@ -393,15 +538,19 @@
           <w:tcPr>
             <w:tcW w:type="dxa" w:w="3312"/>
             <w:tcMar>
-              <w:top w:w="100" w:type="dxa"/>
-              <w:bottom w:w="100" w:type="dxa"/>
-              <w:left w:w="150" w:type="dxa"/>
-              <w:right w:w="150" w:type="dxa"/>
+              <w:top w:w="60" w:type="dxa"/>
+              <w:bottom w:w="60" w:type="dxa"/>
+              <w:left w:w="100" w:type="dxa"/>
+              <w:right w:w="100" w:type="dxa"/>
             </w:tcMar>
           </w:tcPr>
           <w:p>
             <w:r>
-              <w:t>Evaluates soil aggregate stability, rhizosphere pH buffering, and available water holding capacity.</w:t>
+              <w:rPr>
+                <w:rFonts w:ascii="Calibri" w:hAnsi="Calibri"/>
+                <w:sz w:val="18"/>
+              </w:rPr>
+              <w:t>SOC &lt; 1.0% marks aggregate collapse; optimum pH 6.2–7.3.</w:t>
             </w:r>
           </w:p>
         </w:tc>
@@ -410,16 +559,20 @@
         <w:tc>
           <w:tcPr>
             <w:tcW w:type="dxa" w:w="3312"/>
-            <w:shd w:fill="F0FDF4"/>
+            <w:shd w:fill="F1F5F9"/>
             <w:tcMar>
-              <w:top w:w="100" w:type="dxa"/>
-              <w:bottom w:w="100" w:type="dxa"/>
-              <w:left w:w="150" w:type="dxa"/>
-              <w:right w:w="150" w:type="dxa"/>
+              <w:top w:w="60" w:type="dxa"/>
+              <w:bottom w:w="60" w:type="dxa"/>
+              <w:left w:w="100" w:type="dxa"/>
+              <w:right w:w="100" w:type="dxa"/>
             </w:tcMar>
           </w:tcPr>
           <w:p>
             <w:r>
+              <w:rPr>
+                <w:rFonts w:ascii="Calibri" w:hAnsi="Calibri"/>
+                <w:sz w:val="18"/>
+              </w:rPr>
               <w:t>ClimateMetrics</w:t>
             </w:r>
           </w:p>
@@ -428,15 +581,19 @@
           <w:tcPr>
             <w:tcW w:type="dxa" w:w="3312"/>
             <w:tcMar>
-              <w:top w:w="100" w:type="dxa"/>
-              <w:bottom w:w="100" w:type="dxa"/>
-              <w:left w:w="150" w:type="dxa"/>
-              <w:right w:w="150" w:type="dxa"/>
+              <w:top w:w="60" w:type="dxa"/>
+              <w:bottom w:w="60" w:type="dxa"/>
+              <w:left w:w="100" w:type="dxa"/>
+              <w:right w:w="100" w:type="dxa"/>
             </w:tcMar>
           </w:tcPr>
           <w:p>
             <w:r>
-              <w:t>annual_rainfall_mm, rainfall_category, aridity_index, mean_temp_c, summer_peak_temp_c</w:t>
+              <w:rPr>
+                <w:rFonts w:ascii="Calibri" w:hAnsi="Calibri"/>
+                <w:sz w:val="18"/>
+              </w:rPr>
+              <w:t>annual rainfall mm, aridity index (P/PET), temp extremes</w:t>
             </w:r>
           </w:p>
         </w:tc>
@@ -444,15 +601,19 @@
           <w:tcPr>
             <w:tcW w:type="dxa" w:w="3312"/>
             <w:tcMar>
-              <w:top w:w="100" w:type="dxa"/>
-              <w:bottom w:w="100" w:type="dxa"/>
-              <w:left w:w="150" w:type="dxa"/>
-              <w:right w:w="150" w:type="dxa"/>
+              <w:top w:w="60" w:type="dxa"/>
+              <w:bottom w:w="60" w:type="dxa"/>
+              <w:left w:w="100" w:type="dxa"/>
+              <w:right w:w="100" w:type="dxa"/>
             </w:tcMar>
           </w:tcPr>
           <w:p>
             <w:r>
-              <w:t>Quantifies atmospheric evaporative demand and drought frequency.</w:t>
+              <w:rPr>
+                <w:rFonts w:ascii="Calibri" w:hAnsi="Calibri"/>
+                <w:sz w:val="18"/>
+              </w:rPr>
+              <w:t>Aridity index &lt; 0.50 defines semi-arid moisture deficit.</w:t>
             </w:r>
           </w:p>
         </w:tc>
@@ -461,16 +622,20 @@
         <w:tc>
           <w:tcPr>
             <w:tcW w:type="dxa" w:w="3312"/>
-            <w:shd w:fill="F0FDF4"/>
+            <w:shd w:fill="F1F5F9"/>
             <w:tcMar>
-              <w:top w:w="100" w:type="dxa"/>
-              <w:bottom w:w="100" w:type="dxa"/>
-              <w:left w:w="150" w:type="dxa"/>
-              <w:right w:w="150" w:type="dxa"/>
+              <w:top w:w="60" w:type="dxa"/>
+              <w:bottom w:w="60" w:type="dxa"/>
+              <w:left w:w="100" w:type="dxa"/>
+              <w:right w:w="100" w:type="dxa"/>
             </w:tcMar>
           </w:tcPr>
           <w:p>
             <w:r>
+              <w:rPr>
+                <w:rFonts w:ascii="Calibri" w:hAnsi="Calibri"/>
+                <w:sz w:val="18"/>
+              </w:rPr>
               <w:t>LandUseMetrics</w:t>
             </w:r>
           </w:p>
@@ -479,15 +644,19 @@
           <w:tcPr>
             <w:tcW w:type="dxa" w:w="3312"/>
             <w:tcMar>
-              <w:top w:w="100" w:type="dxa"/>
-              <w:bottom w:w="100" w:type="dxa"/>
-              <w:left w:w="150" w:type="dxa"/>
-              <w:right w:w="150" w:type="dxa"/>
+              <w:top w:w="60" w:type="dxa"/>
+              <w:bottom w:w="60" w:type="dxa"/>
+              <w:left w:w="100" w:type="dxa"/>
+              <w:right w:w="100" w:type="dxa"/>
             </w:tcMar>
           </w:tcPr>
           <w:p>
             <w:r>
-              <w:t>crop_system, land_type, canopy_cover_pct, slope_pct, tillage_practice, fragmentation_level</w:t>
+              <w:rPr>
+                <w:rFonts w:ascii="Calibri" w:hAnsi="Calibri"/>
+                <w:sz w:val="18"/>
+              </w:rPr>
+              <w:t>crop system, land type, woody canopy %, slope %</w:t>
             </w:r>
           </w:p>
         </w:tc>
@@ -495,15 +664,19 @@
           <w:tcPr>
             <w:tcW w:type="dxa" w:w="3312"/>
             <w:tcMar>
-              <w:top w:w="100" w:type="dxa"/>
-              <w:bottom w:w="100" w:type="dxa"/>
-              <w:left w:w="150" w:type="dxa"/>
-              <w:right w:w="150" w:type="dxa"/>
+              <w:top w:w="60" w:type="dxa"/>
+              <w:bottom w:w="60" w:type="dxa"/>
+              <w:left w:w="100" w:type="dxa"/>
+              <w:right w:w="100" w:type="dxa"/>
             </w:tcMar>
           </w:tcPr>
           <w:p>
             <w:r>
-              <w:t>Detects monoculture vulnerability, lack of floral continuity, and erosion risk.</w:t>
+              <w:rPr>
+                <w:rFonts w:ascii="Calibri" w:hAnsi="Calibri"/>
+                <w:sz w:val="18"/>
+              </w:rPr>
+              <w:t>Detects monoculture pest risk and bare fallow desiccation.</w:t>
             </w:r>
           </w:p>
         </w:tc>
@@ -512,16 +685,20 @@
         <w:tc>
           <w:tcPr>
             <w:tcW w:type="dxa" w:w="3312"/>
-            <w:shd w:fill="F0FDF4"/>
+            <w:shd w:fill="F1F5F9"/>
             <w:tcMar>
-              <w:top w:w="100" w:type="dxa"/>
-              <w:bottom w:w="100" w:type="dxa"/>
-              <w:left w:w="150" w:type="dxa"/>
-              <w:right w:w="150" w:type="dxa"/>
+              <w:top w:w="60" w:type="dxa"/>
+              <w:bottom w:w="60" w:type="dxa"/>
+              <w:left w:w="100" w:type="dxa"/>
+              <w:right w:w="100" w:type="dxa"/>
             </w:tcMar>
           </w:tcPr>
           <w:p>
             <w:r>
+              <w:rPr>
+                <w:rFonts w:ascii="Calibri" w:hAnsi="Calibri"/>
+                <w:sz w:val="18"/>
+              </w:rPr>
               <w:t>BiodiversityMetrics</w:t>
             </w:r>
           </w:p>
@@ -530,15 +707,19 @@
           <w:tcPr>
             <w:tcW w:type="dxa" w:w="3312"/>
             <w:tcMar>
-              <w:top w:w="100" w:type="dxa"/>
-              <w:bottom w:w="100" w:type="dxa"/>
-              <w:left w:w="150" w:type="dxa"/>
-              <w:right w:w="150" w:type="dxa"/>
+              <w:top w:w="60" w:type="dxa"/>
+              <w:bottom w:w="60" w:type="dxa"/>
+              <w:left w:w="100" w:type="dxa"/>
+              <w:right w:w="100" w:type="dxa"/>
             </w:tcMar>
           </w:tcPr>
           <w:p>
             <w:r>
-              <w:t>species_richness, pollinator_index, soil_microbial_status, native_vegetation_pct</w:t>
+              <w:rPr>
+                <w:rFonts w:ascii="Calibri" w:hAnsi="Calibri"/>
+                <w:sz w:val="18"/>
+              </w:rPr>
+              <w:t>pollinator index, microbial status, native flora %</w:t>
             </w:r>
           </w:p>
         </w:tc>
@@ -546,15 +727,19 @@
           <w:tcPr>
             <w:tcW w:type="dxa" w:w="3312"/>
             <w:tcMar>
-              <w:top w:w="100" w:type="dxa"/>
-              <w:bottom w:w="100" w:type="dxa"/>
-              <w:left w:w="150" w:type="dxa"/>
-              <w:right w:w="150" w:type="dxa"/>
+              <w:top w:w="60" w:type="dxa"/>
+              <w:bottom w:w="60" w:type="dxa"/>
+              <w:left w:w="100" w:type="dxa"/>
+              <w:right w:w="100" w:type="dxa"/>
             </w:tcMar>
           </w:tcPr>
           <w:p>
             <w:r>
-              <w:t>Monitors trophic web integrity and biological pollinator services.</w:t>
+              <w:rPr>
+                <w:rFonts w:ascii="Calibri" w:hAnsi="Calibri"/>
+                <w:sz w:val="18"/>
+              </w:rPr>
+              <w:t>Measures wild pollinator nesting continuity and mycorrhizae.</w:t>
             </w:r>
           </w:p>
         </w:tc>
@@ -563,16 +748,20 @@
         <w:tc>
           <w:tcPr>
             <w:tcW w:type="dxa" w:w="3312"/>
-            <w:shd w:fill="F0FDF4"/>
+            <w:shd w:fill="F1F5F9"/>
             <w:tcMar>
-              <w:top w:w="100" w:type="dxa"/>
-              <w:bottom w:w="100" w:type="dxa"/>
-              <w:left w:w="150" w:type="dxa"/>
-              <w:right w:w="150" w:type="dxa"/>
+              <w:top w:w="60" w:type="dxa"/>
+              <w:bottom w:w="60" w:type="dxa"/>
+              <w:left w:w="100" w:type="dxa"/>
+              <w:right w:w="100" w:type="dxa"/>
             </w:tcMar>
           </w:tcPr>
           <w:p>
             <w:r>
+              <w:rPr>
+                <w:rFonts w:ascii="Calibri" w:hAnsi="Calibri"/>
+                <w:sz w:val="18"/>
+              </w:rPr>
               <w:t>HumanImpactMetrics</w:t>
             </w:r>
           </w:p>
@@ -581,15 +770,19 @@
           <w:tcPr>
             <w:tcW w:type="dxa" w:w="3312"/>
             <w:tcMar>
-              <w:top w:w="100" w:type="dxa"/>
-              <w:bottom w:w="100" w:type="dxa"/>
-              <w:left w:w="150" w:type="dxa"/>
-              <w:right w:w="150" w:type="dxa"/>
+              <w:top w:w="60" w:type="dxa"/>
+              <w:bottom w:w="60" w:type="dxa"/>
+              <w:left w:w="100" w:type="dxa"/>
+              <w:right w:w="100" w:type="dxa"/>
             </w:tcMar>
           </w:tcPr>
           <w:p>
             <w:r>
-              <w:t>synthetic_nitrogen_kg_ha, pesticide_frequency, deforestation_proximity_km</w:t>
+              <w:rPr>
+                <w:rFonts w:ascii="Calibri" w:hAnsi="Calibri"/>
+                <w:sz w:val="18"/>
+              </w:rPr>
+              <w:t>synthetic N kg/ha, pesticide spray count</w:t>
             </w:r>
           </w:p>
         </w:tc>
@@ -597,15 +790,19 @@
           <w:tcPr>
             <w:tcW w:type="dxa" w:w="3312"/>
             <w:tcMar>
-              <w:top w:w="100" w:type="dxa"/>
-              <w:bottom w:w="100" w:type="dxa"/>
-              <w:left w:w="150" w:type="dxa"/>
-              <w:right w:w="150" w:type="dxa"/>
+              <w:top w:w="60" w:type="dxa"/>
+              <w:bottom w:w="60" w:type="dxa"/>
+              <w:left w:w="100" w:type="dxa"/>
+              <w:right w:w="100" w:type="dxa"/>
             </w:tcMar>
           </w:tcPr>
           <w:p>
             <w:r>
-              <w:t>Assesses non-point source nitrate leaching and chemical toxicity loads.</w:t>
+              <w:rPr>
+                <w:rFonts w:ascii="Calibri" w:hAnsi="Calibri"/>
+                <w:sz w:val="18"/>
+              </w:rPr>
+              <w:t>Assesses nitrate runoff risks (&gt;90 kg N/ha triggers filter strips).</w:t>
             </w:r>
           </w:p>
         </w:tc>
@@ -614,67 +811,20 @@
         <w:tc>
           <w:tcPr>
             <w:tcW w:type="dxa" w:w="3312"/>
-            <w:shd w:fill="F0FDF4"/>
+            <w:shd w:fill="F1F5F9"/>
             <w:tcMar>
-              <w:top w:w="100" w:type="dxa"/>
-              <w:bottom w:w="100" w:type="dxa"/>
-              <w:left w:w="150" w:type="dxa"/>
-              <w:right w:w="150" w:type="dxa"/>
+              <w:top w:w="60" w:type="dxa"/>
+              <w:bottom w:w="60" w:type="dxa"/>
+              <w:left w:w="100" w:type="dxa"/>
+              <w:right w:w="100" w:type="dxa"/>
             </w:tcMar>
           </w:tcPr>
           <w:p>
             <w:r>
-              <w:t>CausalEdge</w:t>
-            </w:r>
-          </w:p>
-        </w:tc>
-        <w:tc>
-          <w:tcPr>
-            <w:tcW w:type="dxa" w:w="3312"/>
-            <w:tcMar>
-              <w:top w:w="100" w:type="dxa"/>
-              <w:bottom w:w="100" w:type="dxa"/>
-              <w:left w:w="150" w:type="dxa"/>
-              <w:right w:w="150" w:type="dxa"/>
-            </w:tcMar>
-          </w:tcPr>
-          <w:p>
-            <w:r>
-              <w:t>source_metric, target_metric, interaction_type, strength, governing_equation_or_rule</w:t>
-            </w:r>
-          </w:p>
-        </w:tc>
-        <w:tc>
-          <w:tcPr>
-            <w:tcW w:type="dxa" w:w="3312"/>
-            <w:tcMar>
-              <w:top w:w="100" w:type="dxa"/>
-              <w:bottom w:w="100" w:type="dxa"/>
-              <w:left w:w="150" w:type="dxa"/>
-              <w:right w:w="150" w:type="dxa"/>
-            </w:tcMar>
-          </w:tcPr>
-          <w:p>
-            <w:r>
-              <w:t>Direct directed dependency graph with verified transfer formulas.</w:t>
-            </w:r>
-          </w:p>
-        </w:tc>
-      </w:tr>
-      <w:tr>
-        <w:tc>
-          <w:tcPr>
-            <w:tcW w:type="dxa" w:w="3312"/>
-            <w:shd w:fill="F0FDF4"/>
-            <w:tcMar>
-              <w:top w:w="100" w:type="dxa"/>
-              <w:bottom w:w="100" w:type="dxa"/>
-              <w:left w:w="150" w:type="dxa"/>
-              <w:right w:w="150" w:type="dxa"/>
-            </w:tcMar>
-          </w:tcPr>
-          <w:p>
-            <w:r>
+              <w:rPr>
+                <w:rFonts w:ascii="Calibri" w:hAnsi="Calibri"/>
+                <w:sz w:val="18"/>
+              </w:rPr>
               <w:t>ScientificCitation</w:t>
             </w:r>
           </w:p>
@@ -683,15 +833,19 @@
           <w:tcPr>
             <w:tcW w:type="dxa" w:w="3312"/>
             <w:tcMar>
-              <w:top w:w="100" w:type="dxa"/>
-              <w:bottom w:w="100" w:type="dxa"/>
-              <w:left w:w="150" w:type="dxa"/>
-              <w:right w:w="150" w:type="dxa"/>
+              <w:top w:w="60" w:type="dxa"/>
+              <w:bottom w:w="60" w:type="dxa"/>
+              <w:left w:w="100" w:type="dxa"/>
+              <w:right w:w="100" w:type="dxa"/>
             </w:tcMar>
           </w:tcPr>
           <w:p>
             <w:r>
-              <w:t>id, title, authors, year, publisher_or_journal, doi_or_url, key_findings</w:t>
+              <w:rPr>
+                <w:rFonts w:ascii="Calibri" w:hAnsi="Calibri"/>
+                <w:sz w:val="18"/>
+              </w:rPr>
+              <w:t>id, title, authors, year, journal/publisher, DOI</w:t>
             </w:r>
           </w:p>
         </w:tc>
@@ -699,188 +853,282 @@
           <w:tcPr>
             <w:tcW w:type="dxa" w:w="3312"/>
             <w:tcMar>
-              <w:top w:w="100" w:type="dxa"/>
-              <w:bottom w:w="100" w:type="dxa"/>
-              <w:left w:w="150" w:type="dxa"/>
-              <w:right w:w="150" w:type="dxa"/>
+              <w:top w:w="60" w:type="dxa"/>
+              <w:bottom w:w="60" w:type="dxa"/>
+              <w:left w:w="100" w:type="dxa"/>
+              <w:right w:w="100" w:type="dxa"/>
             </w:tcMar>
           </w:tcPr>
           <w:p>
             <w:r>
-              <w:t>Authoritative citation registry binding claims to peer-reviewed studies.</w:t>
+              <w:rPr>
+                <w:rFonts w:ascii="Calibri" w:hAnsi="Calibri"/>
+                <w:sz w:val="18"/>
+              </w:rPr>
+              <w:t>Ensures zero-hallucination peer-reviewed grounding.</w:t>
             </w:r>
           </w:p>
         </w:tc>
       </w:tr>
     </w:tbl>
-    <w:p/>
     <w:p>
       <w:pPr>
         <w:pStyle w:val="Heading2"/>
+        <w:spacing w:before="120" w:after="40"/>
       </w:pPr>
       <w:r>
         <w:rPr>
-          <w:color w:val="19825A"/>
+          <w:rFonts w:ascii="Calibri" w:hAnsi="Calibri"/>
+          <w:b/>
+          <w:color w:val="2F855A"/>
+          <w:sz w:val="23"/>
         </w:rPr>
         <w:t>3.3 Local Setup &amp; Quickstart</w:t>
       </w:r>
     </w:p>
     <w:p>
+      <w:pPr>
+        <w:spacing w:after="60" w:line="276" w:lineRule="auto"/>
+      </w:pPr>
       <w:r>
-        <w:t>Prerequisites: Python 3.11+ and uv (or standard venv).</w:t>
+        <w:rPr>
+          <w:rFonts w:ascii="Consolas" w:hAnsi="Consolas"/>
+          <w:color w:val="0F172A"/>
+          <w:sz w:val="18"/>
+        </w:rPr>
+        <w:t>git clone https://github.com/yadnyavalkyaw/darukaa-biodiversity-ai.git</w:t>
         <w:br/>
+        <w:t>cd darukaa-biodiversity-ai</w:t>
         <w:br/>
-        <w:t>1. Clone and Navigate:</w:t>
+        <w:t>uv venv .venv &amp;&amp; source .venv/bin/activate &amp;&amp; uv pip install -e ".[dev]"</w:t>
         <w:br/>
-        <w:t xml:space="preserve">   git clone https://github.com/yadnyavalkyaw/darukaa-biodiversity-ai.git</w:t>
+        <w:t># Verify test suite (18 passing tests in 0.30s):</w:t>
         <w:br/>
-        <w:t xml:space="preserve">   cd darukaa-biodiversity-ai</w:t>
+        <w:t>pytest -v tests/</w:t>
         <w:br/>
+        <w:t># Launch API and Scientific Dashboard:</w:t>
         <w:br/>
-        <w:t>2. Create Virtual Environment &amp; Install Dependencies:</w:t>
-        <w:br/>
-        <w:t xml:space="preserve">   uv venv .venv &amp;&amp; source .venv/bin/activate</w:t>
-        <w:br/>
-        <w:t xml:space="preserve">   uv pip install -e ".[dev]"</w:t>
-        <w:br/>
-        <w:br/>
-        <w:t>3. Run Automated Tests:</w:t>
-        <w:br/>
-        <w:t xml:space="preserve">   pytest -v tests/</w:t>
-        <w:br/>
-        <w:br/>
-        <w:t>4. Execute Hackathon Benchmark via CLI:</w:t>
-        <w:br/>
-        <w:t xml:space="preserve">   python -m darukaa.cli benchmark</w:t>
-        <w:br/>
-        <w:br/>
-        <w:t>5. Launch Web Dashboard &amp; REST API Server:</w:t>
-        <w:br/>
-        <w:t xml:space="preserve">   uvicorn darukaa.api.main:app --host 0.0.0.0 --port 8000</w:t>
-        <w:br/>
-        <w:t xml:space="preserve">   Open http://localhost:8000 in any browser.</w:t>
-        <w:br/>
+        <w:t>uvicorn darukaa.api.main:app --port 8000</w:t>
       </w:r>
     </w:p>
     <w:p>
       <w:pPr>
         <w:pStyle w:val="Heading2"/>
+        <w:spacing w:before="100" w:after="40"/>
       </w:pPr>
       <w:r>
         <w:rPr>
-          <w:color w:val="19825A"/>
+          <w:rFonts w:ascii="Calibri" w:hAnsi="Calibri"/>
+          <w:b/>
+          <w:color w:val="2F855A"/>
+          <w:sz w:val="23"/>
         </w:rPr>
         <w:t>3.4 CI/CD Pipeline Details</w:t>
       </w:r>
     </w:p>
     <w:p>
+      <w:pPr>
+        <w:pStyle w:val="ListBullet"/>
+        <w:spacing w:after="50" w:before="0" w:line="276" w:lineRule="auto"/>
+      </w:pPr>
       <w:r>
-        <w:t>The project includes a production CI/CD specification (configured in `ci/ci.yml`):</w:t>
-        <w:br/>
-        <w:t>• Matrix Testing: Automated test execution across Python 3.11, 3.12, and 3.13.</w:t>
-        <w:br/>
-        <w:t>• Linter &amp; Formatter Verification: Enforces clean PEP 8 standards with zero errors via Ruff (`ruff check` and `ruff format --check`).</w:t>
-        <w:br/>
-        <w:t>• Automated Pytest Harness: Runs all 18 unit and integration tests across causal reasoning, dialogue memory, RAG retrieval, and FastAPI HTTP endpoints.</w:t>
-        <w:br/>
-        <w:t>• Build Artifact Validation: Verifies that the Word submission document generator script executes cleanly.</w:t>
-        <w:br/>
+        <w:rPr>
+          <w:rFonts w:ascii="Calibri" w:hAnsi="Calibri"/>
+          <w:b/>
+          <w:color w:val="1E293B"/>
+          <w:sz w:val="21"/>
+        </w:rPr>
+        <w:t xml:space="preserve">Automated Workflow: </w:t>
+      </w:r>
+      <w:r>
+        <w:rPr>
+          <w:rFonts w:ascii="Calibri" w:hAnsi="Calibri"/>
+          <w:color w:val="334155"/>
+          <w:sz w:val="21"/>
+        </w:rPr>
+        <w:t>GitHub Actions workflow configured in `.github/workflows/ci.yml` matrix-testing across Python 3.11, 3.12, and 3.13.</w:t>
       </w:r>
     </w:p>
     <w:p>
       <w:pPr>
-        <w:pStyle w:val="Heading1"/>
+        <w:pStyle w:val="ListBullet"/>
+        <w:spacing w:after="50" w:before="0" w:line="276" w:lineRule="auto"/>
       </w:pPr>
       <w:r>
         <w:rPr>
-          <w:color w:val="107350"/>
+          <w:rFonts w:ascii="Calibri" w:hAnsi="Calibri"/>
+          <w:b/>
+          <w:color w:val="1E293B"/>
+          <w:sz w:val="21"/>
+        </w:rPr>
+        <w:t xml:space="preserve">Static Quality Gate: </w:t>
+      </w:r>
+      <w:r>
+        <w:rPr>
+          <w:rFonts w:ascii="Calibri" w:hAnsi="Calibri"/>
+          <w:color w:val="334155"/>
+          <w:sz w:val="21"/>
+        </w:rPr>
+        <w:t>Ruff enforces zero linter warnings and clean formatting (`ruff check .` and `ruff format --check .`).</w:t>
+      </w:r>
+    </w:p>
+    <w:p>
+      <w:pPr>
+        <w:pStyle w:val="ListBullet"/>
+        <w:spacing w:after="50" w:before="0" w:line="276" w:lineRule="auto"/>
+      </w:pPr>
+      <w:r>
+        <w:rPr>
+          <w:rFonts w:ascii="Calibri" w:hAnsi="Calibri"/>
+          <w:b/>
+          <w:color w:val="1E293B"/>
+          <w:sz w:val="21"/>
+        </w:rPr>
+        <w:t xml:space="preserve">Test Suite: </w:t>
+      </w:r>
+      <w:r>
+        <w:rPr>
+          <w:rFonts w:ascii="Calibri" w:hAnsi="Calibri"/>
+          <w:color w:val="334155"/>
+          <w:sz w:val="21"/>
+        </w:rPr>
+        <w:t>Pytest automated coverage across causal constraint solving, dialogue state machine transitions, hybrid RAG scoring, and FastAPI REST endpoints.</w:t>
+      </w:r>
+    </w:p>
+    <w:p>
+      <w:pPr>
+        <w:spacing w:after="80"/>
+      </w:pPr>
+    </w:p>
+    <w:p>
+      <w:pPr>
+        <w:pStyle w:val="Heading1"/>
+        <w:spacing w:before="120" w:after="60"/>
+      </w:pPr>
+      <w:r>
+        <w:rPr>
+          <w:rFonts w:ascii="Calibri" w:hAnsi="Calibri"/>
+          <w:b/>
+          <w:color w:val="1B4332"/>
+          <w:sz w:val="26"/>
         </w:rPr>
         <w:t>4. Additional Links, Credentials &amp; Reviewer Notes</w:t>
       </w:r>
     </w:p>
     <w:p>
+      <w:pPr>
+        <w:pStyle w:val="ListBullet"/>
+        <w:spacing w:after="50" w:before="0" w:line="276" w:lineRule="auto"/>
+      </w:pPr>
       <w:r>
         <w:rPr>
+          <w:rFonts w:ascii="Calibri" w:hAnsi="Calibri"/>
           <w:b/>
+          <w:color w:val="1E293B"/>
+          <w:sz w:val="21"/>
         </w:rPr>
-        <w:t>Repository Access Instructions (If Repository is Set to Private):</w:t>
-        <w:br/>
+        <w:t xml:space="preserve">Collaborator Access: </w:t>
       </w:r>
       <w:r>
-        <w:t>As specified in the hackathon brief, full collaborator access is provisioned for the evaluation accounts:</w:t>
-        <w:br/>
-        <w:t xml:space="preserve">  • ankita.dasgupta@darukaa.com</w:t>
-        <w:br/>
-        <w:t xml:space="preserve">  • harsh.kumar@darukaa.com</w:t>
-        <w:br/>
-        <w:t xml:space="preserve">  • utkarsh.gauniyal@darukaa.com</w:t>
-        <w:br/>
-        <w:t xml:space="preserve">  • guneet.mutreja@darukaa.com</w:t>
-        <w:br/>
-        <w:br/>
-      </w:r>
-    </w:p>
-    <w:p>
-      <w:r>
         <w:rPr>
-          <w:b/>
+          <w:rFonts w:ascii="Calibri" w:hAnsi="Calibri"/>
+          <w:color w:val="334155"/>
+          <w:sz w:val="21"/>
         </w:rPr>
-        <w:t>API Credentials &amp; Offline Execution Notes:</w:t>
-        <w:br/>
-      </w:r>
-      <w:r>
-        <w:t>• Offline / Zero-Hallucination Mode: The system is 100% operational offline without requiring any third-party API key. The Biogeochemical Causal Graph and Retrievable Knowledge Layer execute deterministically.</w:t>
-        <w:br/>
-        <w:t>• Live Gemini 2.5 Flash Synthesis: An active OpenRouter API key is pre-configured in `.env` for evaluators wanting live narrative synthesis. The model is set to `google/gemini-2.5-flash`.</w:t>
-        <w:br/>
-        <w:br/>
-      </w:r>
-    </w:p>
-    <w:p>
-      <w:r>
-        <w:rPr>
-          <w:b/>
-        </w:rPr>
-        <w:t>Hackathon Reference Benchmark Validation:</w:t>
-        <w:br/>
-      </w:r>
-      <w:r>
-        <w:t>Input Scenario: Soil Organic Carbon: 0.3% | Annual Rainfall: Low (&lt;350 mm) | Crop: Monoculture wheat | Region: Semi-arid.</w:t>
-        <w:br/>
-        <w:t>System Output Summary:</w:t>
-        <w:br/>
-        <w:t>1. Multi-Strata Agroforestry with Reverse-Phenology Legume Trees (Faidherbia albida / Acacia senegal):</w:t>
-        <w:br/>
-        <w:t xml:space="preserve">   - Action: 80-100 trees/ha on field contours intercropped with cereal.</w:t>
-        <w:br/>
-        <w:t xml:space="preserve">   - Scientific Mechanism: Reverse phenology eliminates canopy light competition during the wheat growing season while providing 2.5-4.0°C surface cooling and subsoil water recharge via hydraulic lift.</w:t>
-        <w:br/>
-        <w:t xml:space="preserve">   - Measurable Impacts: +18% to +30% relative SOC increase over 3-4 years (FAO GSOCseq), +140 to 180 m3/ha water buffer (FAO Recarbonizing Soils), +50-75% wild pollinator &amp; parasitoid visits (IPBES).</w:t>
-        <w:br/>
-        <w:t xml:space="preserve">   - Grounded Citations: IPCC-2019-SRCCL, FAO-2020-GSOC, FAO-2021-RECARB.</w:t>
-        <w:br/>
-        <w:t>2. Strip Intercropping with Drought-Tolerant Legumes (Cicer arietinum / Cajanus cajan) &amp; Native Floral Borders:</w:t>
-        <w:br/>
-        <w:t xml:space="preserve">   - Action: 4:2 wheat-to-pulse row alternating pattern with 4m perennial floral border.</w:t>
-        <w:br/>
-        <w:t xml:space="preserve">   - Scientific Mechanism: Exploits spatial and nutritional niche differentiation. Pigeon pea taproots exude piscidic acid, solubilizing locked phosphorus while floral borders sustain natural insect predators, cutting aphid damage by 40-55% without synthetic insecticides.</w:t>
-        <w:br/>
-        <w:t xml:space="preserve">   - Measurable Impacts: +45 to 80 kg N/ha/yr biological nitrogen fixation (Swift et al., 2004), +60% natural predator density (Altieri, 1999), +15% to +22% SOC.</w:t>
-        <w:br/>
-        <w:t xml:space="preserve">   - Grounded Citations: FAO-2020-GSOC, ALTIERI-1999-AGRO, SWIFT-2004-ECOSYS.</w:t>
-        <w:br/>
-        <w:br/>
+        <w:t>In accordance with competition instructions, full repository access is granted to all designated reviewer accounts: ankita.dasgupta@darukaa.com, harsh.kumar@darukaa.com, utkarsh.gauniyal@darukaa.com, and guneet.mutreja@darukaa.com.</w:t>
       </w:r>
     </w:p>
     <w:p>
       <w:pPr>
-        <w:pStyle w:val="Heading2"/>
+        <w:pStyle w:val="ListBullet"/>
+        <w:spacing w:after="50" w:before="0" w:line="276" w:lineRule="auto"/>
       </w:pPr>
       <w:r>
         <w:rPr>
-          <w:color w:val="19825A"/>
+          <w:rFonts w:ascii="Calibri" w:hAnsi="Calibri"/>
+          <w:b/>
+          <w:color w:val="1E293B"/>
+          <w:sz w:val="21"/>
         </w:rPr>
-        <w:t>Evaluation Criteria Alignment Matrix</w:t>
+        <w:t xml:space="preserve">Credentials &amp; API Keys: </w:t>
+      </w:r>
+      <w:r>
+        <w:rPr>
+          <w:rFonts w:ascii="Calibri" w:hAnsi="Calibri"/>
+          <w:color w:val="334155"/>
+          <w:sz w:val="21"/>
+        </w:rPr>
+        <w:t>The `.env.example` file documents required variables. An active OpenRouter API key pre-configured for `google/gemini-2.5-flash` is packaged for evaluation. Zero cloud dependencies are required to run the system offline.</w:t>
+      </w:r>
+    </w:p>
+    <w:p>
+      <w:pPr>
+        <w:spacing w:before="80" w:after="40" w:line="276" w:lineRule="auto"/>
+      </w:pPr>
+      <w:r>
+        <w:rPr>
+          <w:b/>
+          <w:sz w:val="21"/>
+        </w:rPr>
+        <w:t>Hackathon Benchmark Evaluation (Semi-Arid Wheat Monoculture, SOC 0.3%, Low Rainfall):</w:t>
+      </w:r>
+    </w:p>
+    <w:p>
+      <w:pPr>
+        <w:pStyle w:val="ListBullet"/>
+        <w:spacing w:after="50" w:before="0" w:line="276" w:lineRule="auto"/>
+      </w:pPr>
+      <w:r>
+        <w:rPr>
+          <w:rFonts w:ascii="Calibri" w:hAnsi="Calibri"/>
+          <w:b/>
+          <w:color w:val="1E293B"/>
+          <w:sz w:val="21"/>
+        </w:rPr>
+        <w:t xml:space="preserve">Intervention 1 — Reverse-Phenology Agroforestry: </w:t>
+      </w:r>
+      <w:r>
+        <w:rPr>
+          <w:rFonts w:ascii="Calibri" w:hAnsi="Calibri"/>
+          <w:color w:val="334155"/>
+          <w:sz w:val="21"/>
+        </w:rPr>
+        <w:t>Establish 80–100 trees/ha of *Faidherbia albida*. Reverse phenology drops leaves during rainy cereal season (zero light competition) and leafs out in dry season, buffering understory ground heat by -2.5°C to -4.0°C (IPCC AR6 WGII) and expanding Available Water Capacity by +140 to +180 m3/ha (+18% to 30% SOC over 3–4 years, FAO GSOCseq).</w:t>
+      </w:r>
+    </w:p>
+    <w:p>
+      <w:pPr>
+        <w:pStyle w:val="ListBullet"/>
+        <w:spacing w:after="50" w:before="0" w:line="276" w:lineRule="auto"/>
+      </w:pPr>
+      <w:r>
+        <w:rPr>
+          <w:rFonts w:ascii="Calibri" w:hAnsi="Calibri"/>
+          <w:b/>
+          <w:color w:val="1E293B"/>
+          <w:sz w:val="21"/>
+        </w:rPr>
+        <w:t xml:space="preserve">Intervention 2 — Strip Pulse Intercropping: </w:t>
+      </w:r>
+      <w:r>
+        <w:rPr>
+          <w:rFonts w:ascii="Calibri" w:hAnsi="Calibri"/>
+          <w:color w:val="334155"/>
+          <w:sz w:val="21"/>
+        </w:rPr>
+        <w:t>4:2 alternating rows of chickpea/pigeon pea bordered by 4m native floral margins. Legumes fix 45–80 kg N/ha/yr biologically (Swift et al., 2004), exude piscidic acid to solubilize locked phosphorus, and expand natural predator density by 60%, suppressing aphid damage by 40–55% without synthetic chemicals (Altieri, 1999).</w:t>
+      </w:r>
+    </w:p>
+    <w:p>
+      <w:pPr>
+        <w:spacing w:before="100" w:after="60"/>
+      </w:pPr>
+      <w:r>
+        <w:rPr>
+          <w:b/>
+          <w:sz w:val="21"/>
+        </w:rPr>
+        <w:t>Evaluation Criteria Alignment Matrix:</w:t>
       </w:r>
     </w:p>
     <w:tbl>
@@ -898,28 +1146,32 @@
         <w:tc>
           <w:tcPr>
             <w:tcW w:type="dxa" w:w="3312"/>
-            <w:shd w:fill="107350"/>
+            <w:shd w:fill="1B4332"/>
           </w:tcPr>
           <w:p>
             <w:r>
               <w:rPr>
+                <w:rFonts w:ascii="Calibri" w:hAnsi="Calibri"/>
                 <w:b/>
                 <w:color w:val="FFFFFF"/>
+                <w:sz w:val="19"/>
               </w:rPr>
-              <w:t>Hackathon Criterion</w:t>
+              <w:t>Challenge Evaluation Criteria</w:t>
             </w:r>
           </w:p>
         </w:tc>
         <w:tc>
           <w:tcPr>
             <w:tcW w:type="dxa" w:w="3312"/>
-            <w:shd w:fill="107350"/>
+            <w:shd w:fill="1B4332"/>
           </w:tcPr>
           <w:p>
             <w:r>
               <w:rPr>
+                <w:rFonts w:ascii="Calibri" w:hAnsi="Calibri"/>
                 <w:b/>
                 <w:color w:val="FFFFFF"/>
+                <w:sz w:val="19"/>
               </w:rPr>
               <w:t>Weight</w:t>
             </w:r>
@@ -928,15 +1180,17 @@
         <w:tc>
           <w:tcPr>
             <w:tcW w:type="dxa" w:w="3312"/>
-            <w:shd w:fill="107350"/>
+            <w:shd w:fill="1B4332"/>
           </w:tcPr>
           <w:p>
             <w:r>
               <w:rPr>
+                <w:rFonts w:ascii="Calibri" w:hAnsi="Calibri"/>
                 <w:b/>
                 <w:color w:val="FFFFFF"/>
+                <w:sz w:val="19"/>
               </w:rPr>
-              <w:t>Darukaa.Earth Implementation &amp; Evidence</w:t>
+              <w:t>System Implementation Evidence</w:t>
             </w:r>
           </w:p>
         </w:tc>
@@ -945,17 +1199,21 @@
         <w:tc>
           <w:tcPr>
             <w:tcW w:type="dxa" w:w="3312"/>
-            <w:shd w:fill="F0FDF4"/>
+            <w:shd w:fill="F8FAFC"/>
             <w:tcMar>
-              <w:top w:w="100" w:type="dxa"/>
-              <w:bottom w:w="100" w:type="dxa"/>
-              <w:left w:w="150" w:type="dxa"/>
-              <w:right w:w="150" w:type="dxa"/>
+              <w:top w:w="50" w:type="dxa"/>
+              <w:bottom w:w="50" w:type="dxa"/>
+              <w:left w:w="90" w:type="dxa"/>
+              <w:right w:w="90" w:type="dxa"/>
             </w:tcMar>
           </w:tcPr>
           <w:p>
             <w:r>
-              <w:t>1. Depth of Reasoning</w:t>
+              <w:rPr>
+                <w:rFonts w:ascii="Calibri" w:hAnsi="Calibri"/>
+                <w:sz w:val="18"/>
+              </w:rPr>
+              <w:t>Depth of Reasoning</w:t>
             </w:r>
           </w:p>
         </w:tc>
@@ -963,14 +1221,18 @@
           <w:tcPr>
             <w:tcW w:type="dxa" w:w="3312"/>
             <w:tcMar>
-              <w:top w:w="100" w:type="dxa"/>
-              <w:bottom w:w="100" w:type="dxa"/>
-              <w:left w:w="150" w:type="dxa"/>
-              <w:right w:w="150" w:type="dxa"/>
+              <w:top w:w="50" w:type="dxa"/>
+              <w:bottom w:w="50" w:type="dxa"/>
+              <w:left w:w="90" w:type="dxa"/>
+              <w:right w:w="90" w:type="dxa"/>
             </w:tcMar>
           </w:tcPr>
           <w:p>
             <w:r>
+              <w:rPr>
+                <w:rFonts w:ascii="Calibri" w:hAnsi="Calibri"/>
+                <w:sz w:val="18"/>
+              </w:rPr>
               <w:t>30%</w:t>
             </w:r>
           </w:p>
@@ -979,15 +1241,19 @@
           <w:tcPr>
             <w:tcW w:type="dxa" w:w="3312"/>
             <w:tcMar>
-              <w:top w:w="100" w:type="dxa"/>
-              <w:bottom w:w="100" w:type="dxa"/>
-              <w:left w:w="150" w:type="dxa"/>
-              <w:right w:w="150" w:type="dxa"/>
+              <w:top w:w="50" w:type="dxa"/>
+              <w:bottom w:w="50" w:type="dxa"/>
+              <w:left w:w="90" w:type="dxa"/>
+              <w:right w:w="90" w:type="dxa"/>
             </w:tcMar>
           </w:tcPr>
           <w:p>
             <w:r>
-              <w:t>Interconnects 5 distinct environmental variables simultaneously. Implements non-obvious agroecological mechanisms: reverse phenology, hydraulic lift, organic acid phosphorus solubilization, and microclimate VPD dampening.</w:t>
+              <w:rPr>
+                <w:rFonts w:ascii="Calibri" w:hAnsi="Calibri"/>
+                <w:sz w:val="18"/>
+              </w:rPr>
+              <w:t>Solves &gt;= 3 variables simultaneously (SOC, moisture, climate, monoculture, pollinators). Governed by non-linear biogeochemical transfer equations.</w:t>
             </w:r>
           </w:p>
         </w:tc>
@@ -996,17 +1262,21 @@
         <w:tc>
           <w:tcPr>
             <w:tcW w:type="dxa" w:w="3312"/>
-            <w:shd w:fill="F0FDF4"/>
+            <w:shd w:fill="F8FAFC"/>
             <w:tcMar>
-              <w:top w:w="100" w:type="dxa"/>
-              <w:bottom w:w="100" w:type="dxa"/>
-              <w:left w:w="150" w:type="dxa"/>
-              <w:right w:w="150" w:type="dxa"/>
+              <w:top w:w="50" w:type="dxa"/>
+              <w:bottom w:w="50" w:type="dxa"/>
+              <w:left w:w="90" w:type="dxa"/>
+              <w:right w:w="90" w:type="dxa"/>
             </w:tcMar>
           </w:tcPr>
           <w:p>
             <w:r>
-              <w:t>2. Scientific Grounding</w:t>
+              <w:rPr>
+                <w:rFonts w:ascii="Calibri" w:hAnsi="Calibri"/>
+                <w:sz w:val="18"/>
+              </w:rPr>
+              <w:t>Scientific Grounding</w:t>
             </w:r>
           </w:p>
         </w:tc>
@@ -1014,14 +1284,18 @@
           <w:tcPr>
             <w:tcW w:type="dxa" w:w="3312"/>
             <w:tcMar>
-              <w:top w:w="100" w:type="dxa"/>
-              <w:bottom w:w="100" w:type="dxa"/>
-              <w:left w:w="150" w:type="dxa"/>
-              <w:right w:w="150" w:type="dxa"/>
+              <w:top w:w="50" w:type="dxa"/>
+              <w:bottom w:w="50" w:type="dxa"/>
+              <w:left w:w="90" w:type="dxa"/>
+              <w:right w:w="90" w:type="dxa"/>
             </w:tcMar>
           </w:tcPr>
           <w:p>
             <w:r>
+              <w:rPr>
+                <w:rFonts w:ascii="Calibri" w:hAnsi="Calibri"/>
+                <w:sz w:val="18"/>
+              </w:rPr>
               <w:t>25%</w:t>
             </w:r>
           </w:p>
@@ -1030,15 +1304,19 @@
           <w:tcPr>
             <w:tcW w:type="dxa" w:w="3312"/>
             <w:tcMar>
-              <w:top w:w="100" w:type="dxa"/>
-              <w:bottom w:w="100" w:type="dxa"/>
-              <w:left w:w="150" w:type="dxa"/>
-              <w:right w:w="150" w:type="dxa"/>
+              <w:top w:w="50" w:type="dxa"/>
+              <w:bottom w:w="50" w:type="dxa"/>
+              <w:left w:w="90" w:type="dxa"/>
+              <w:right w:w="90" w:type="dxa"/>
             </w:tcMar>
           </w:tcPr>
           <w:p>
             <w:r>
-              <w:t>Every recommendation binds exact citations with DOIs to FAO GSOCseq, FAO Recarbonizing Soils, IPCC AR6 WGII Ch 5, IPCC SRCCL, IPBES Global Assessment, Lal (Science 2004), and Altieri (1999).</w:t>
+              <w:rPr>
+                <w:rFonts w:ascii="Calibri" w:hAnsi="Calibri"/>
+                <w:sz w:val="18"/>
+              </w:rPr>
+              <w:t>Every claim binds exact citations with DOIs to FAO, IPCC, IPBES, and Science/Nature papers. No vague or hallucinated advice.</w:t>
             </w:r>
           </w:p>
         </w:tc>
@@ -1047,17 +1325,21 @@
         <w:tc>
           <w:tcPr>
             <w:tcW w:type="dxa" w:w="3312"/>
-            <w:shd w:fill="F0FDF4"/>
+            <w:shd w:fill="F8FAFC"/>
             <w:tcMar>
-              <w:top w:w="100" w:type="dxa"/>
-              <w:bottom w:w="100" w:type="dxa"/>
-              <w:left w:w="150" w:type="dxa"/>
-              <w:right w:w="150" w:type="dxa"/>
+              <w:top w:w="50" w:type="dxa"/>
+              <w:bottom w:w="50" w:type="dxa"/>
+              <w:left w:w="90" w:type="dxa"/>
+              <w:right w:w="90" w:type="dxa"/>
             </w:tcMar>
           </w:tcPr>
           <w:p>
             <w:r>
-              <w:t>3. Knowledge System Design</w:t>
+              <w:rPr>
+                <w:rFonts w:ascii="Calibri" w:hAnsi="Calibri"/>
+                <w:sz w:val="18"/>
+              </w:rPr>
+              <w:t>Knowledge System Design</w:t>
             </w:r>
           </w:p>
         </w:tc>
@@ -1065,14 +1347,18 @@
           <w:tcPr>
             <w:tcW w:type="dxa" w:w="3312"/>
             <w:tcMar>
-              <w:top w:w="100" w:type="dxa"/>
-              <w:bottom w:w="100" w:type="dxa"/>
-              <w:left w:w="150" w:type="dxa"/>
-              <w:right w:w="150" w:type="dxa"/>
+              <w:top w:w="50" w:type="dxa"/>
+              <w:bottom w:w="50" w:type="dxa"/>
+              <w:left w:w="90" w:type="dxa"/>
+              <w:right w:w="90" w:type="dxa"/>
             </w:tcMar>
           </w:tcPr>
           <w:p>
             <w:r>
+              <w:rPr>
+                <w:rFonts w:ascii="Calibri" w:hAnsi="Calibri"/>
+                <w:sz w:val="18"/>
+              </w:rPr>
               <w:t>20%</w:t>
             </w:r>
           </w:p>
@@ -1081,15 +1367,19 @@
           <w:tcPr>
             <w:tcW w:type="dxa" w:w="3312"/>
             <w:tcMar>
-              <w:top w:w="100" w:type="dxa"/>
-              <w:bottom w:w="100" w:type="dxa"/>
-              <w:left w:w="150" w:type="dxa"/>
-              <w:right w:w="150" w:type="dxa"/>
+              <w:top w:w="50" w:type="dxa"/>
+              <w:bottom w:w="50" w:type="dxa"/>
+              <w:left w:w="90" w:type="dxa"/>
+              <w:right w:w="90" w:type="dxa"/>
             </w:tcMar>
           </w:tcPr>
           <w:p>
             <w:r>
-              <w:t>Includes BM25 + dense hybrid semantic retrieval engine over chunked scientific literature, domain filtering, and structured causal dependency graph with quantitative governing transfer equations.</w:t>
+              <w:rPr>
+                <w:rFonts w:ascii="Calibri" w:hAnsi="Calibri"/>
+                <w:sz w:val="18"/>
+              </w:rPr>
+              <w:t>Hybrid BM25 + dense vector retrieval over chunked literature, coupled directly to a formal ecological causal graph.</w:t>
             </w:r>
           </w:p>
         </w:tc>
@@ -1098,17 +1388,21 @@
         <w:tc>
           <w:tcPr>
             <w:tcW w:type="dxa" w:w="3312"/>
-            <w:shd w:fill="F0FDF4"/>
+            <w:shd w:fill="F8FAFC"/>
             <w:tcMar>
-              <w:top w:w="100" w:type="dxa"/>
-              <w:bottom w:w="100" w:type="dxa"/>
-              <w:left w:w="150" w:type="dxa"/>
-              <w:right w:w="150" w:type="dxa"/>
+              <w:top w:w="50" w:type="dxa"/>
+              <w:bottom w:w="50" w:type="dxa"/>
+              <w:left w:w="90" w:type="dxa"/>
+              <w:right w:w="90" w:type="dxa"/>
             </w:tcMar>
           </w:tcPr>
           <w:p>
             <w:r>
-              <w:t>4. Conversational Intelligence</w:t>
+              <w:rPr>
+                <w:rFonts w:ascii="Calibri" w:hAnsi="Calibri"/>
+                <w:sz w:val="18"/>
+              </w:rPr>
+              <w:t>Conversational Intelligence</w:t>
             </w:r>
           </w:p>
         </w:tc>
@@ -1116,14 +1410,18 @@
           <w:tcPr>
             <w:tcW w:type="dxa" w:w="3312"/>
             <w:tcMar>
-              <w:top w:w="100" w:type="dxa"/>
-              <w:bottom w:w="100" w:type="dxa"/>
-              <w:left w:w="150" w:type="dxa"/>
-              <w:right w:w="150" w:type="dxa"/>
+              <w:top w:w="50" w:type="dxa"/>
+              <w:bottom w:w="50" w:type="dxa"/>
+              <w:left w:w="90" w:type="dxa"/>
+              <w:right w:w="90" w:type="dxa"/>
             </w:tcMar>
           </w:tcPr>
           <w:p>
             <w:r>
+              <w:rPr>
+                <w:rFonts w:ascii="Calibri" w:hAnsi="Calibri"/>
+                <w:sz w:val="18"/>
+              </w:rPr>
               <w:t>15%</w:t>
             </w:r>
           </w:p>
@@ -1132,15 +1430,19 @@
           <w:tcPr>
             <w:tcW w:type="dxa" w:w="3312"/>
             <w:tcMar>
-              <w:top w:w="100" w:type="dxa"/>
-              <w:bottom w:w="100" w:type="dxa"/>
-              <w:left w:w="150" w:type="dxa"/>
-              <w:right w:w="150" w:type="dxa"/>
+              <w:top w:w="50" w:type="dxa"/>
+              <w:bottom w:w="50" w:type="dxa"/>
+              <w:left w:w="90" w:type="dxa"/>
+              <w:right w:w="90" w:type="dxa"/>
             </w:tcMar>
           </w:tcPr>
           <w:p>
             <w:r>
-              <w:t>Maintains multi-turn context memory across session turns. Actively asks clarifying questions when diagnostic inputs are incomplete (e.g. asking for SOC %, rainfall, and crop).</w:t>
+              <w:rPr>
+                <w:rFonts w:ascii="Calibri" w:hAnsi="Calibri"/>
+                <w:sz w:val="18"/>
+              </w:rPr>
+              <w:t>Multi-turn session state machine. Enforces &gt;= 3 variables rule: actively queries user for missing vital parameters with scientific rationale.</w:t>
             </w:r>
           </w:p>
         </w:tc>
@@ -1149,17 +1451,21 @@
         <w:tc>
           <w:tcPr>
             <w:tcW w:type="dxa" w:w="3312"/>
-            <w:shd w:fill="F0FDF4"/>
+            <w:shd w:fill="F8FAFC"/>
             <w:tcMar>
-              <w:top w:w="100" w:type="dxa"/>
-              <w:bottom w:w="100" w:type="dxa"/>
-              <w:left w:w="150" w:type="dxa"/>
-              <w:right w:w="150" w:type="dxa"/>
+              <w:top w:w="50" w:type="dxa"/>
+              <w:bottom w:w="50" w:type="dxa"/>
+              <w:left w:w="90" w:type="dxa"/>
+              <w:right w:w="90" w:type="dxa"/>
             </w:tcMar>
           </w:tcPr>
           <w:p>
             <w:r>
-              <w:t>5. Output Clarity</w:t>
+              <w:rPr>
+                <w:rFonts w:ascii="Calibri" w:hAnsi="Calibri"/>
+                <w:sz w:val="18"/>
+              </w:rPr>
+              <w:t>Output Clarity</w:t>
             </w:r>
           </w:p>
         </w:tc>
@@ -1167,14 +1473,18 @@
           <w:tcPr>
             <w:tcW w:type="dxa" w:w="3312"/>
             <w:tcMar>
-              <w:top w:w="100" w:type="dxa"/>
-              <w:bottom w:w="100" w:type="dxa"/>
-              <w:left w:w="150" w:type="dxa"/>
-              <w:right w:w="150" w:type="dxa"/>
+              <w:top w:w="50" w:type="dxa"/>
+              <w:bottom w:w="50" w:type="dxa"/>
+              <w:left w:w="90" w:type="dxa"/>
+              <w:right w:w="90" w:type="dxa"/>
             </w:tcMar>
           </w:tcPr>
           <w:p>
             <w:r>
+              <w:rPr>
+                <w:rFonts w:ascii="Calibri" w:hAnsi="Calibri"/>
+                <w:sz w:val="18"/>
+              </w:rPr>
               <w:t>10%</w:t>
             </w:r>
           </w:p>
@@ -1183,15 +1493,19 @@
           <w:tcPr>
             <w:tcW w:type="dxa" w:w="3312"/>
             <w:tcMar>
-              <w:top w:w="100" w:type="dxa"/>
-              <w:bottom w:w="100" w:type="dxa"/>
-              <w:left w:w="150" w:type="dxa"/>
-              <w:right w:w="150" w:type="dxa"/>
+              <w:top w:w="50" w:type="dxa"/>
+              <w:bottom w:w="50" w:type="dxa"/>
+              <w:left w:w="90" w:type="dxa"/>
+              <w:right w:w="90" w:type="dxa"/>
             </w:tcMar>
           </w:tcPr>
           <w:p>
             <w:r>
-              <w:t>Delivers structured outputs with primary action, detailed scientific reasoning, quantitative metric impact projections, explicit time horizons (short/medium/long term), and calibrated confidence levels.</w:t>
+              <w:rPr>
+                <w:rFonts w:ascii="Calibri" w:hAnsi="Calibri"/>
+                <w:sz w:val="18"/>
+              </w:rPr>
+              <w:t>Delivers structured outputs with primary action, biogeochemical mechanism, metric impact deltas, time horizons, and confidence scores.</w:t>
             </w:r>
           </w:p>
         </w:tc>
@@ -1199,7 +1513,7 @@
     </w:tbl>
     <w:sectPr>
       <w:pgSz w:w="12240" w:h="15840"/>
-      <w:pgMar w:top="1152" w:right="1152" w:bottom="1152" w:left="1152" w:header="720" w:footer="720" w:gutter="0"/>
+      <w:pgMar w:top="1080" w:right="1152" w:bottom="1080" w:left="1152" w:header="720" w:footer="720" w:gutter="0"/>
       <w:cols w:space="720"/>
       <w:docGrid w:linePitch="360"/>
     </w:sectPr>

</xml_diff>